<commit_message>
HU: ya usuarios y organizaciones terminado
</commit_message>
<xml_diff>
--- a/_docs_/trim5/HISTORIAS DE USUARIO - DONACIONES, USUARIOS.docx
+++ b/_docs_/trim5/HISTORIAS DE USUARIO - DONACIONES, USUARIOS.docx
@@ -1120,6 +1120,7 @@
     <w:tbl>
       <w:tblPr>
         <w:tblStyle w:val="Tablaconcuadrcula"/>
+        <w:tblpPr w:leftFromText="141" w:rightFromText="141" w:horzAnchor="margin" w:tblpY="-615"/>
         <w:tblW w:w="8931" w:type="dxa"/>
         <w:tblLook w:val="04A0" w:firstRow="1" w:lastRow="0" w:firstColumn="1" w:lastColumn="0" w:noHBand="0" w:noVBand="1"/>
       </w:tblPr>
@@ -1972,7 +1973,6 @@
                 <w:b/>
                 <w:bCs/>
               </w:rPr>
-              <w:lastRenderedPageBreak/>
               <w:t>RNF</w:t>
             </w:r>
           </w:p>
@@ -2220,12 +2220,14 @@
               <w:rPr>
                 <w:rFonts w:ascii="Segoe UI" w:hAnsi="Segoe UI" w:cs="Segoe UI"/>
                 <w:color w:val="0F1115"/>
+                <w:u w:val="single"/>
               </w:rPr>
             </w:pPr>
             <w:r>
               <w:rPr>
                 <w:rFonts w:ascii="Segoe UI" w:hAnsi="Segoe UI" w:cs="Segoe UI"/>
                 <w:color w:val="0F1115"/>
+                <w:u w:val="single"/>
               </w:rPr>
               <w:t>La organización solo debe visualizar usuarios vinculados a su entidad.</w:t>
             </w:r>
@@ -2514,6 +2516,14 @@
         </w:tc>
       </w:tr>
     </w:tbl>
+    <w:p>
+      <w:pPr>
+        <w:rPr>
+          <w:b/>
+          <w:bCs/>
+        </w:rPr>
+      </w:pPr>
+    </w:p>
     <w:p>
       <w:pPr>
         <w:rPr>
@@ -2636,14 +2646,7 @@
                 <w:b/>
                 <w:bCs/>
               </w:rPr>
-              <w:t>0</w:t>
-            </w:r>
-            <w:r>
-              <w:rPr>
-                <w:b/>
-                <w:bCs/>
-              </w:rPr>
-              <w:t>6</w:t>
+              <w:t>06</w:t>
             </w:r>
           </w:p>
         </w:tc>
@@ -3014,10 +3017,7 @@
           </w:tcPr>
           <w:p>
             <w:r>
-              <w:t>Alta</w:t>
-            </w:r>
-            <w:r>
-              <w:t xml:space="preserve"> </w:t>
+              <w:t xml:space="preserve">Alta </w:t>
             </w:r>
           </w:p>
         </w:tc>
@@ -3049,10 +3049,7 @@
           </w:tcPr>
           <w:p>
             <w:r>
-              <w:t>00</w:t>
-            </w:r>
-            <w:r>
-              <w:t>6</w:t>
+              <w:t>006</w:t>
             </w:r>
           </w:p>
         </w:tc>
@@ -3084,10 +3081,7 @@
           </w:tcPr>
           <w:p>
             <w:r>
-              <w:t>00</w:t>
-            </w:r>
-            <w:r>
-              <w:t>6</w:t>
+              <w:t>006</w:t>
             </w:r>
           </w:p>
         </w:tc>
@@ -3223,14 +3217,7 @@
                 <w:b/>
                 <w:bCs/>
               </w:rPr>
-              <w:t>0</w:t>
-            </w:r>
-            <w:r>
-              <w:rPr>
-                <w:b/>
-                <w:bCs/>
-              </w:rPr>
-              <w:t>7</w:t>
+              <w:t>07</w:t>
             </w:r>
           </w:p>
         </w:tc>
@@ -3502,17 +3489,9 @@
                 <w:lang w:eastAsia="es-419"/>
                 <w14:ligatures w14:val="none"/>
               </w:rPr>
-              <w:t>La invalidación del token debe ser inmediata y segura (blacklist o expiración forzada).</w:t>
-            </w:r>
-          </w:p>
-          <w:p>
-            <w:pPr>
-              <w:pStyle w:val="Prrafodelista"/>
-              <w:numPr>
-                <w:ilvl w:val="0"/>
-                <w:numId w:val="19"/>
-              </w:numPr>
-            </w:pPr>
+              <w:t>La invalidación del token debe ser inmediata y segura (</w:t>
+            </w:r>
+            <w:proofErr w:type="spellStart"/>
             <w:r>
               <w:rPr>
                 <w:rFonts w:ascii="Segoe UI" w:eastAsia="Times New Roman" w:hAnsi="Segoe UI" w:cs="Segoe UI"/>
@@ -3521,17 +3500,9 @@
                 <w:lang w:eastAsia="es-419"/>
                 <w14:ligatures w14:val="none"/>
               </w:rPr>
-              <w:t>Debe limpiar completamente el estado de sesión en el cliente (localStorage, cookies).</w:t>
-            </w:r>
-          </w:p>
-          <w:p>
-            <w:pPr>
-              <w:pStyle w:val="Prrafodelista"/>
-              <w:numPr>
-                <w:ilvl w:val="0"/>
-                <w:numId w:val="19"/>
-              </w:numPr>
-            </w:pPr>
+              <w:t>blacklist</w:t>
+            </w:r>
+            <w:proofErr w:type="spellEnd"/>
             <w:r>
               <w:rPr>
                 <w:rFonts w:ascii="Segoe UI" w:eastAsia="Times New Roman" w:hAnsi="Segoe UI" w:cs="Segoe UI"/>
@@ -3540,6 +3511,66 @@
                 <w:lang w:eastAsia="es-419"/>
                 <w14:ligatures w14:val="none"/>
               </w:rPr>
+              <w:t xml:space="preserve"> o expiración forzada).</w:t>
+            </w:r>
+          </w:p>
+          <w:p>
+            <w:pPr>
+              <w:pStyle w:val="Prrafodelista"/>
+              <w:numPr>
+                <w:ilvl w:val="0"/>
+                <w:numId w:val="19"/>
+              </w:numPr>
+            </w:pPr>
+            <w:r>
+              <w:rPr>
+                <w:rFonts w:ascii="Segoe UI" w:eastAsia="Times New Roman" w:hAnsi="Segoe UI" w:cs="Segoe UI"/>
+                <w:color w:val="0F1115"/>
+                <w:kern w:val="0"/>
+                <w:lang w:eastAsia="es-419"/>
+                <w14:ligatures w14:val="none"/>
+              </w:rPr>
+              <w:t>Debe limpiar completamente el estado de sesión en el cliente (</w:t>
+            </w:r>
+            <w:proofErr w:type="spellStart"/>
+            <w:r>
+              <w:rPr>
+                <w:rFonts w:ascii="Segoe UI" w:eastAsia="Times New Roman" w:hAnsi="Segoe UI" w:cs="Segoe UI"/>
+                <w:color w:val="0F1115"/>
+                <w:kern w:val="0"/>
+                <w:lang w:eastAsia="es-419"/>
+                <w14:ligatures w14:val="none"/>
+              </w:rPr>
+              <w:t>localStorage</w:t>
+            </w:r>
+            <w:proofErr w:type="spellEnd"/>
+            <w:r>
+              <w:rPr>
+                <w:rFonts w:ascii="Segoe UI" w:eastAsia="Times New Roman" w:hAnsi="Segoe UI" w:cs="Segoe UI"/>
+                <w:color w:val="0F1115"/>
+                <w:kern w:val="0"/>
+                <w:lang w:eastAsia="es-419"/>
+                <w14:ligatures w14:val="none"/>
+              </w:rPr>
+              <w:t>, cookies).</w:t>
+            </w:r>
+          </w:p>
+          <w:p>
+            <w:pPr>
+              <w:pStyle w:val="Prrafodelista"/>
+              <w:numPr>
+                <w:ilvl w:val="0"/>
+                <w:numId w:val="19"/>
+              </w:numPr>
+            </w:pPr>
+            <w:r>
+              <w:rPr>
+                <w:rFonts w:ascii="Segoe UI" w:eastAsia="Times New Roman" w:hAnsi="Segoe UI" w:cs="Segoe UI"/>
+                <w:color w:val="0F1115"/>
+                <w:kern w:val="0"/>
+                <w:lang w:eastAsia="es-419"/>
+                <w14:ligatures w14:val="none"/>
+              </w:rPr>
               <w:t>La interfaz debe ser clara y accesible en dispositivos móviles y web.</w:t>
             </w:r>
           </w:p>
@@ -3572,10 +3603,7 @@
           </w:tcPr>
           <w:p>
             <w:r>
-              <w:t>Media</w:t>
-            </w:r>
-            <w:r>
-              <w:t xml:space="preserve"> </w:t>
+              <w:t xml:space="preserve">Media </w:t>
             </w:r>
           </w:p>
         </w:tc>
@@ -3607,10 +3635,7 @@
           </w:tcPr>
           <w:p>
             <w:r>
-              <w:t>00</w:t>
-            </w:r>
-            <w:r>
-              <w:t>7</w:t>
+              <w:t>007</w:t>
             </w:r>
           </w:p>
         </w:tc>
@@ -3642,10 +3667,7 @@
           </w:tcPr>
           <w:p>
             <w:r>
-              <w:t>00</w:t>
-            </w:r>
-            <w:r>
-              <w:t>7</w:t>
+              <w:t>007</w:t>
             </w:r>
           </w:p>
         </w:tc>
@@ -3773,14 +3795,7 @@
                 <w:b/>
                 <w:bCs/>
               </w:rPr>
-              <w:t>0</w:t>
-            </w:r>
-            <w:r>
-              <w:rPr>
-                <w:b/>
-                <w:bCs/>
-              </w:rPr>
-              <w:t>8</w:t>
+              <w:t>08</w:t>
             </w:r>
           </w:p>
         </w:tc>
@@ -4203,10 +4218,7 @@
           </w:tcPr>
           <w:p>
             <w:r>
-              <w:t>Alta</w:t>
-            </w:r>
-            <w:r>
-              <w:t xml:space="preserve"> </w:t>
+              <w:t xml:space="preserve">Alta </w:t>
             </w:r>
           </w:p>
         </w:tc>
@@ -4238,10 +4250,7 @@
           </w:tcPr>
           <w:p>
             <w:r>
-              <w:t>00</w:t>
-            </w:r>
-            <w:r>
-              <w:t>8</w:t>
+              <w:t>008</w:t>
             </w:r>
           </w:p>
         </w:tc>
@@ -4273,10 +4282,7 @@
           </w:tcPr>
           <w:p>
             <w:r>
-              <w:t>00</w:t>
-            </w:r>
-            <w:r>
-              <w:t>8</w:t>
+              <w:t>008</w:t>
             </w:r>
           </w:p>
         </w:tc>
@@ -4380,14 +4386,7 @@
                 <w:b/>
                 <w:bCs/>
               </w:rPr>
-              <w:t>0</w:t>
-            </w:r>
-            <w:r>
-              <w:rPr>
-                <w:b/>
-                <w:bCs/>
-              </w:rPr>
-              <w:t>9</w:t>
+              <w:t>09</w:t>
             </w:r>
           </w:p>
         </w:tc>
@@ -4425,11 +4424,14 @@
               <w:rPr>
                 <w:b/>
                 <w:bCs/>
-                <w:lang w:val="es-419"/>
-              </w:rPr>
-            </w:pPr>
-            <w:r>
-              <w:t>Recuperar contraseña</w:t>
+              </w:rPr>
+            </w:pPr>
+            <w:r>
+              <w:rPr>
+                <w:b/>
+                <w:bCs/>
+              </w:rPr>
+              <w:t>Crear organización</w:t>
             </w:r>
           </w:p>
         </w:tc>
@@ -4468,7 +4470,7 @@
               <w:t>Como </w:t>
             </w:r>
             <w:r>
-              <w:t>usuario registrado (Solicitante, Voluntario, Organización o Administrador),</w:t>
+              <w:t>representante de una organización o administrador del sistema,</w:t>
             </w:r>
             <w:r>
               <w:rPr>
@@ -4478,7 +4480,7 @@
               <w:t> quiero </w:t>
             </w:r>
             <w:r>
-              <w:t>poder recuperar mi contraseña a través de mi correo electrónico,</w:t>
+              <w:t>poder registrar una nueva organización en la plataforma,</w:t>
             </w:r>
             <w:r>
               <w:rPr>
@@ -4488,7 +4490,7 @@
               <w:t> para </w:t>
             </w:r>
             <w:r>
-              <w:t>restablecer el acceso a mi cuenta en caso de olvido.</w:t>
+              <w:t>que pueda gestionar sus actividades, voluntarios y solicitudes dentro del sistema.</w:t>
             </w:r>
           </w:p>
         </w:tc>
@@ -4549,17 +4551,8 @@
                 <w:lang w:eastAsia="es-419"/>
                 <w14:ligatures w14:val="none"/>
               </w:rPr>
-              <w:t>El sistema debe proporcionar un enlace "¿Olvidaste tu contraseña?" en la pantalla de inicio de sesión.</w:t>
-            </w:r>
-          </w:p>
-          <w:p>
-            <w:pPr>
-              <w:pStyle w:val="Prrafodelista"/>
-              <w:numPr>
-                <w:ilvl w:val="0"/>
-                <w:numId w:val="21"/>
-              </w:numPr>
-            </w:pPr>
+              <w:t>El sistema debe permitir registrar una organización con los siguientes datos: nombre,</w:t>
+            </w:r>
             <w:r>
               <w:rPr>
                 <w:rFonts w:ascii="Segoe UI" w:eastAsia="Times New Roman" w:hAnsi="Segoe UI" w:cs="Segoe UI"/>
@@ -4568,17 +4561,8 @@
                 <w:lang w:eastAsia="es-419"/>
                 <w14:ligatures w14:val="none"/>
               </w:rPr>
-              <w:t>Debe solicitar al usuario ingresar su correo electrónico registrado.</w:t>
-            </w:r>
-          </w:p>
-          <w:p>
-            <w:pPr>
-              <w:pStyle w:val="Prrafodelista"/>
-              <w:numPr>
-                <w:ilvl w:val="0"/>
-                <w:numId w:val="21"/>
-              </w:numPr>
-            </w:pPr>
+              <w:t xml:space="preserve"> NIT,</w:t>
+            </w:r>
             <w:r>
               <w:rPr>
                 <w:rFonts w:ascii="Segoe UI" w:eastAsia="Times New Roman" w:hAnsi="Segoe UI" w:cs="Segoe UI"/>
@@ -4587,17 +4571,8 @@
                 <w:lang w:eastAsia="es-419"/>
                 <w14:ligatures w14:val="none"/>
               </w:rPr>
-              <w:t>Debe verificar que el correo exista en el sistema.</w:t>
-            </w:r>
-          </w:p>
-          <w:p>
-            <w:pPr>
-              <w:pStyle w:val="Prrafodelista"/>
-              <w:numPr>
-                <w:ilvl w:val="0"/>
-                <w:numId w:val="21"/>
-              </w:numPr>
-            </w:pPr>
+              <w:t xml:space="preserve"> dirección, correo electrónico institucional</w:t>
+            </w:r>
             <w:r>
               <w:rPr>
                 <w:rFonts w:ascii="Segoe UI" w:eastAsia="Times New Roman" w:hAnsi="Segoe UI" w:cs="Segoe UI"/>
@@ -4606,7 +4581,7 @@
                 <w:lang w:eastAsia="es-419"/>
                 <w14:ligatures w14:val="none"/>
               </w:rPr>
-              <w:t>Si el correo existe, debe enviar un enlace seguro y único para restablecer la contraseña (token cifrado).</w:t>
+              <w:t xml:space="preserve"> y contraseña.</w:t>
             </w:r>
           </w:p>
           <w:p>
@@ -4625,7 +4600,7 @@
                 <w:lang w:eastAsia="es-419"/>
                 <w14:ligatures w14:val="none"/>
               </w:rPr>
-              <w:t>Si el correo no existe, debe mostrar mensaje de error claro.</w:t>
+              <w:t>El correo electrónico y NIT deben ser únicos en el sistema.</w:t>
             </w:r>
           </w:p>
           <w:p>
@@ -4644,8 +4619,17 @@
                 <w:lang w:eastAsia="es-419"/>
                 <w14:ligatures w14:val="none"/>
               </w:rPr>
-              <w:t>El enlace de recuperación debe tener vigencia de 15 minutos</w:t>
-            </w:r>
+              <w:t>Todos los campos obligatorios deben estar completos; de lo contrario, mostrar mensaje de error.</w:t>
+            </w:r>
+          </w:p>
+          <w:p>
+            <w:pPr>
+              <w:pStyle w:val="Prrafodelista"/>
+              <w:numPr>
+                <w:ilvl w:val="0"/>
+                <w:numId w:val="21"/>
+              </w:numPr>
+            </w:pPr>
             <w:r>
               <w:rPr>
                 <w:rFonts w:ascii="Segoe UI" w:eastAsia="Times New Roman" w:hAnsi="Segoe UI" w:cs="Segoe UI"/>
@@ -4654,17 +4638,8 @@
                 <w:lang w:eastAsia="es-419"/>
                 <w14:ligatures w14:val="none"/>
               </w:rPr>
-              <w:t>.</w:t>
-            </w:r>
-          </w:p>
-          <w:p>
-            <w:pPr>
-              <w:pStyle w:val="Prrafodelista"/>
-              <w:numPr>
-                <w:ilvl w:val="0"/>
-                <w:numId w:val="21"/>
-              </w:numPr>
-            </w:pPr>
+              <w:t>Al registrar, se debe crear automáticamente un usuario administrador para la organización</w:t>
+            </w:r>
             <w:r>
               <w:rPr>
                 <w:rFonts w:ascii="Segoe UI" w:eastAsia="Times New Roman" w:hAnsi="Segoe UI" w:cs="Segoe UI"/>
@@ -4673,17 +4648,8 @@
                 <w:lang w:eastAsia="es-419"/>
                 <w14:ligatures w14:val="none"/>
               </w:rPr>
-              <w:t>Al hacer clic en el enlace, debe redirigir a una página para ingresar nueva contraseña.</w:t>
-            </w:r>
-          </w:p>
-          <w:p>
-            <w:pPr>
-              <w:pStyle w:val="Prrafodelista"/>
-              <w:numPr>
-                <w:ilvl w:val="0"/>
-                <w:numId w:val="21"/>
-              </w:numPr>
-            </w:pPr>
+              <w:t xml:space="preserve"> (aun </w:t>
+            </w:r>
             <w:r>
               <w:rPr>
                 <w:rFonts w:ascii="Segoe UI" w:eastAsia="Times New Roman" w:hAnsi="Segoe UI" w:cs="Segoe UI"/>
@@ -4692,7 +4658,7 @@
                 <w:lang w:eastAsia="es-419"/>
                 <w14:ligatures w14:val="none"/>
               </w:rPr>
-              <w:t>La nueva contraseña debe cumplir con requisitos de seguridad (mínimo 8 caracteres, mayúsculas, números y símbolos)</w:t>
+              <w:t>así,</w:t>
             </w:r>
             <w:r>
               <w:rPr>
@@ -4702,17 +4668,8 @@
                 <w:lang w:eastAsia="es-419"/>
                 <w14:ligatures w14:val="none"/>
               </w:rPr>
-              <w:t>.</w:t>
-            </w:r>
-          </w:p>
-          <w:p>
-            <w:pPr>
-              <w:pStyle w:val="Prrafodelista"/>
-              <w:numPr>
-                <w:ilvl w:val="0"/>
-                <w:numId w:val="21"/>
-              </w:numPr>
-            </w:pPr>
+              <w:t xml:space="preserve"> llevara el nombre de ‘organización’)</w:t>
+            </w:r>
             <w:r>
               <w:rPr>
                 <w:rFonts w:ascii="Segoe UI" w:eastAsia="Times New Roman" w:hAnsi="Segoe UI" w:cs="Segoe UI"/>
@@ -4721,7 +4678,7 @@
                 <w:lang w:eastAsia="es-419"/>
                 <w14:ligatures w14:val="none"/>
               </w:rPr>
-              <w:t>Debe confirmar el cambio de contraseña y notificar al usuario vía correo.</w:t>
+              <w:t>.</w:t>
             </w:r>
           </w:p>
           <w:p>
@@ -4740,7 +4697,7 @@
                 <w:lang w:eastAsia="es-419"/>
                 <w14:ligatures w14:val="none"/>
               </w:rPr>
-              <w:t>Solo se permite un intento de recuperación cada 5 minutos por seguridad.</w:t>
+              <w:t>Se debe enviar una notificación de confirmación al correo institucional.</w:t>
             </w:r>
           </w:p>
           <w:p>
@@ -4750,16 +4707,19 @@
                 <w:ilvl w:val="0"/>
                 <w:numId w:val="21"/>
               </w:numPr>
+              <w:rPr>
+                <w:color w:val="ADADAD" w:themeColor="background2" w:themeShade="BF"/>
+              </w:rPr>
             </w:pPr>
             <w:r>
               <w:rPr>
                 <w:rFonts w:ascii="Segoe UI" w:eastAsia="Times New Roman" w:hAnsi="Segoe UI" w:cs="Segoe UI"/>
-                <w:color w:val="0F1115"/>
+                <w:color w:val="ADADAD" w:themeColor="background2" w:themeShade="BF"/>
                 <w:kern w:val="0"/>
                 <w:lang w:eastAsia="es-419"/>
                 <w14:ligatures w14:val="none"/>
               </w:rPr>
-              <w:t>El envío del correo debe completarse en menos de 3 segundos.</w:t>
+              <w:t>La organización debe quedar en estado "Pendiente de verificación" hasta que el administrador general la active.</w:t>
             </w:r>
           </w:p>
           <w:p>
@@ -4778,7 +4738,45 @@
                 <w:lang w:eastAsia="es-419"/>
                 <w14:ligatures w14:val="none"/>
               </w:rPr>
-              <w:t>La interfaz debe ser responsiva y accesible en móviles y web.</w:t>
+              <w:t>El registro debe completarse en menos de 3 segundos.</w:t>
+            </w:r>
+          </w:p>
+          <w:p>
+            <w:pPr>
+              <w:pStyle w:val="Prrafodelista"/>
+              <w:numPr>
+                <w:ilvl w:val="0"/>
+                <w:numId w:val="21"/>
+              </w:numPr>
+            </w:pPr>
+            <w:r>
+              <w:rPr>
+                <w:rFonts w:ascii="Segoe UI" w:eastAsia="Times New Roman" w:hAnsi="Segoe UI" w:cs="Segoe UI"/>
+                <w:color w:val="0F1115"/>
+                <w:kern w:val="0"/>
+                <w:lang w:eastAsia="es-419"/>
+                <w14:ligatures w14:val="none"/>
+              </w:rPr>
+              <w:t>Los datos deben almacenarse de forma segura con cifrado.</w:t>
+            </w:r>
+          </w:p>
+          <w:p>
+            <w:pPr>
+              <w:pStyle w:val="Prrafodelista"/>
+              <w:numPr>
+                <w:ilvl w:val="0"/>
+                <w:numId w:val="21"/>
+              </w:numPr>
+            </w:pPr>
+            <w:r>
+              <w:rPr>
+                <w:rFonts w:ascii="Segoe UI" w:eastAsia="Times New Roman" w:hAnsi="Segoe UI" w:cs="Segoe UI"/>
+                <w:color w:val="0F1115"/>
+                <w:kern w:val="0"/>
+                <w:lang w:eastAsia="es-419"/>
+                <w14:ligatures w14:val="none"/>
+              </w:rPr>
+              <w:t>La interfaz debe ser clara y accesible en dispositivos móviles y web.</w:t>
             </w:r>
           </w:p>
         </w:tc>
@@ -4842,7 +4840,10 @@
           </w:tcPr>
           <w:p>
             <w:r>
-              <w:t>008</w:t>
+              <w:t>00</w:t>
+            </w:r>
+            <w:r>
+              <w:t>1</w:t>
             </w:r>
           </w:p>
         </w:tc>
@@ -4874,12 +4875,1766 @@
           </w:tcPr>
           <w:p>
             <w:r>
-              <w:t>008</w:t>
+              <w:t>00</w:t>
+            </w:r>
+            <w:r>
+              <w:t>1</w:t>
             </w:r>
           </w:p>
         </w:tc>
       </w:tr>
     </w:tbl>
+    <w:p>
+      <w:pPr>
+        <w:rPr>
+          <w:b/>
+          <w:bCs/>
+        </w:rPr>
+      </w:pPr>
+    </w:p>
+    <w:p>
+      <w:pPr>
+        <w:rPr>
+          <w:b/>
+          <w:bCs/>
+        </w:rPr>
+      </w:pPr>
+    </w:p>
+    <w:p>
+      <w:pPr>
+        <w:rPr>
+          <w:b/>
+          <w:bCs/>
+        </w:rPr>
+      </w:pPr>
+    </w:p>
+    <w:p>
+      <w:pPr>
+        <w:rPr>
+          <w:b/>
+          <w:bCs/>
+        </w:rPr>
+      </w:pPr>
+    </w:p>
+    <w:p>
+      <w:pPr>
+        <w:rPr>
+          <w:b/>
+          <w:bCs/>
+        </w:rPr>
+      </w:pPr>
+    </w:p>
+    <w:p>
+      <w:pPr>
+        <w:rPr>
+          <w:b/>
+          <w:bCs/>
+        </w:rPr>
+      </w:pPr>
+    </w:p>
+    <w:p>
+      <w:pPr>
+        <w:rPr>
+          <w:b/>
+          <w:bCs/>
+        </w:rPr>
+      </w:pPr>
+    </w:p>
+    <w:p>
+      <w:pPr>
+        <w:rPr>
+          <w:b/>
+          <w:bCs/>
+        </w:rPr>
+      </w:pPr>
+    </w:p>
+    <w:tbl>
+      <w:tblPr>
+        <w:tblStyle w:val="Tablaconcuadrcula"/>
+        <w:tblW w:w="0" w:type="auto"/>
+        <w:tblLook w:val="04A0" w:firstRow="1" w:lastRow="0" w:firstColumn="1" w:lastColumn="0" w:noHBand="0" w:noVBand="1"/>
+      </w:tblPr>
+      <w:tblGrid>
+        <w:gridCol w:w="1980"/>
+        <w:gridCol w:w="6848"/>
+      </w:tblGrid>
+      <w:tr>
+        <w:tc>
+          <w:tcPr>
+            <w:tcW w:w="1980" w:type="dxa"/>
+            <w:tcBorders>
+              <w:top w:val="nil"/>
+              <w:left w:val="nil"/>
+              <w:bottom w:val="single" w:sz="4" w:space="0" w:color="auto"/>
+              <w:right w:val="single" w:sz="4" w:space="0" w:color="auto"/>
+            </w:tcBorders>
+          </w:tcPr>
+          <w:p>
+            <w:pPr>
+              <w:jc w:val="center"/>
+              <w:rPr>
+                <w:b/>
+                <w:bCs/>
+              </w:rPr>
+            </w:pPr>
+          </w:p>
+        </w:tc>
+        <w:tc>
+          <w:tcPr>
+            <w:tcW w:w="6848" w:type="dxa"/>
+            <w:tcBorders>
+              <w:left w:val="single" w:sz="4" w:space="0" w:color="auto"/>
+            </w:tcBorders>
+          </w:tcPr>
+          <w:p>
+            <w:pPr>
+              <w:jc w:val="center"/>
+              <w:rPr>
+                <w:b/>
+                <w:bCs/>
+              </w:rPr>
+            </w:pPr>
+            <w:r>
+              <w:rPr>
+                <w:b/>
+                <w:bCs/>
+              </w:rPr>
+              <w:t>HU 0</w:t>
+            </w:r>
+            <w:r>
+              <w:rPr>
+                <w:b/>
+                <w:bCs/>
+              </w:rPr>
+              <w:t>10</w:t>
+            </w:r>
+          </w:p>
+        </w:tc>
+      </w:tr>
+      <w:tr>
+        <w:tc>
+          <w:tcPr>
+            <w:tcW w:w="1980" w:type="dxa"/>
+            <w:tcBorders>
+              <w:top w:val="single" w:sz="4" w:space="0" w:color="auto"/>
+            </w:tcBorders>
+          </w:tcPr>
+          <w:p>
+            <w:pPr>
+              <w:rPr>
+                <w:b/>
+                <w:bCs/>
+              </w:rPr>
+            </w:pPr>
+            <w:r>
+              <w:rPr>
+                <w:b/>
+                <w:bCs/>
+              </w:rPr>
+              <w:t>NOMBRE</w:t>
+            </w:r>
+          </w:p>
+        </w:tc>
+        <w:tc>
+          <w:tcPr>
+            <w:tcW w:w="6848" w:type="dxa"/>
+          </w:tcPr>
+          <w:p>
+            <w:pPr>
+              <w:rPr>
+                <w:b/>
+                <w:bCs/>
+              </w:rPr>
+            </w:pPr>
+            <w:r>
+              <w:rPr>
+                <w:b/>
+                <w:bCs/>
+              </w:rPr>
+              <w:t>Actualizar organización</w:t>
+            </w:r>
+          </w:p>
+        </w:tc>
+      </w:tr>
+      <w:tr>
+        <w:tc>
+          <w:tcPr>
+            <w:tcW w:w="1980" w:type="dxa"/>
+          </w:tcPr>
+          <w:p>
+            <w:pPr>
+              <w:rPr>
+                <w:b/>
+                <w:bCs/>
+              </w:rPr>
+            </w:pPr>
+            <w:r>
+              <w:rPr>
+                <w:b/>
+                <w:bCs/>
+              </w:rPr>
+              <w:t xml:space="preserve">DESCRPCION </w:t>
+            </w:r>
+          </w:p>
+        </w:tc>
+        <w:tc>
+          <w:tcPr>
+            <w:tcW w:w="6848" w:type="dxa"/>
+          </w:tcPr>
+          <w:p>
+            <w:r>
+              <w:rPr>
+                <w:b/>
+                <w:bCs/>
+              </w:rPr>
+              <w:t>Como </w:t>
+            </w:r>
+            <w:r>
+              <w:t>representante de una organización o administrador del sistema,</w:t>
+            </w:r>
+            <w:r>
+              <w:rPr>
+                <w:b/>
+                <w:bCs/>
+              </w:rPr>
+              <w:t> quiero </w:t>
+            </w:r>
+            <w:r>
+              <w:t>poder actualizar la información de mi organización,</w:t>
+            </w:r>
+            <w:r>
+              <w:rPr>
+                <w:b/>
+                <w:bCs/>
+              </w:rPr>
+              <w:t> para </w:t>
+            </w:r>
+            <w:r>
+              <w:t>mantener los datos actualizados y correctos en la plataforma.</w:t>
+            </w:r>
+          </w:p>
+        </w:tc>
+      </w:tr>
+      <w:tr>
+        <w:tc>
+          <w:tcPr>
+            <w:tcW w:w="1980" w:type="dxa"/>
+          </w:tcPr>
+          <w:p>
+            <w:pPr>
+              <w:rPr>
+                <w:b/>
+                <w:bCs/>
+              </w:rPr>
+            </w:pPr>
+            <w:r>
+              <w:rPr>
+                <w:b/>
+                <w:bCs/>
+              </w:rPr>
+              <w:t>CRITERIOS DE</w:t>
+            </w:r>
+          </w:p>
+          <w:p>
+            <w:pPr>
+              <w:rPr>
+                <w:b/>
+                <w:bCs/>
+              </w:rPr>
+            </w:pPr>
+            <w:r>
+              <w:rPr>
+                <w:b/>
+                <w:bCs/>
+              </w:rPr>
+              <w:t>EVALUACIÓN</w:t>
+            </w:r>
+          </w:p>
+        </w:tc>
+        <w:tc>
+          <w:tcPr>
+            <w:tcW w:w="6848" w:type="dxa"/>
+          </w:tcPr>
+          <w:p>
+            <w:pPr>
+              <w:pStyle w:val="Prrafodelista"/>
+              <w:numPr>
+                <w:ilvl w:val="0"/>
+                <w:numId w:val="22"/>
+              </w:numPr>
+            </w:pPr>
+            <w:r>
+              <w:rPr>
+                <w:rFonts w:ascii="Segoe UI" w:eastAsia="Times New Roman" w:hAnsi="Segoe UI" w:cs="Segoe UI"/>
+                <w:color w:val="0F1115"/>
+                <w:kern w:val="0"/>
+                <w:lang w:eastAsia="es-419"/>
+                <w14:ligatures w14:val="none"/>
+              </w:rPr>
+              <w:t>El sistema debe permitir modificar los datos de la organización: nombre, dirección, descripción</w:t>
+            </w:r>
+            <w:r>
+              <w:rPr>
+                <w:rFonts w:ascii="Segoe UI" w:eastAsia="Times New Roman" w:hAnsi="Segoe UI" w:cs="Segoe UI"/>
+                <w:color w:val="0F1115"/>
+                <w:kern w:val="0"/>
+                <w:lang w:eastAsia="es-419"/>
+                <w14:ligatures w14:val="none"/>
+              </w:rPr>
+              <w:t xml:space="preserve"> </w:t>
+            </w:r>
+            <w:r>
+              <w:rPr>
+                <w:rFonts w:ascii="Segoe UI" w:eastAsia="Times New Roman" w:hAnsi="Segoe UI" w:cs="Segoe UI"/>
+                <w:color w:val="0F1115"/>
+                <w:kern w:val="0"/>
+                <w:lang w:eastAsia="es-419"/>
+                <w14:ligatures w14:val="none"/>
+              </w:rPr>
+              <w:t>y logo.</w:t>
+            </w:r>
+          </w:p>
+          <w:p>
+            <w:pPr>
+              <w:pStyle w:val="Prrafodelista"/>
+              <w:numPr>
+                <w:ilvl w:val="0"/>
+                <w:numId w:val="22"/>
+              </w:numPr>
+            </w:pPr>
+            <w:r>
+              <w:rPr>
+                <w:rFonts w:ascii="Segoe UI" w:eastAsia="Times New Roman" w:hAnsi="Segoe UI" w:cs="Segoe UI"/>
+                <w:color w:val="0F1115"/>
+                <w:kern w:val="0"/>
+                <w:lang w:eastAsia="es-419"/>
+                <w14:ligatures w14:val="none"/>
+              </w:rPr>
+              <w:t>El NIT y correo institucional no pueden modificarse sin autorización del administrador general.</w:t>
+            </w:r>
+          </w:p>
+          <w:p>
+            <w:pPr>
+              <w:pStyle w:val="Prrafodelista"/>
+              <w:numPr>
+                <w:ilvl w:val="0"/>
+                <w:numId w:val="22"/>
+              </w:numPr>
+            </w:pPr>
+            <w:r>
+              <w:rPr>
+                <w:rFonts w:ascii="Segoe UI" w:eastAsia="Times New Roman" w:hAnsi="Segoe UI" w:cs="Segoe UI"/>
+                <w:color w:val="0F1115"/>
+                <w:kern w:val="0"/>
+                <w:lang w:eastAsia="es-419"/>
+                <w14:ligatures w14:val="none"/>
+              </w:rPr>
+              <w:t>Los cambios deben ser validados (formato de correo, etc.).</w:t>
+            </w:r>
+          </w:p>
+          <w:p>
+            <w:pPr>
+              <w:pStyle w:val="Prrafodelista"/>
+              <w:numPr>
+                <w:ilvl w:val="0"/>
+                <w:numId w:val="22"/>
+              </w:numPr>
+            </w:pPr>
+            <w:r>
+              <w:rPr>
+                <w:rFonts w:ascii="Segoe UI" w:eastAsia="Times New Roman" w:hAnsi="Segoe UI" w:cs="Segoe UI"/>
+                <w:color w:val="0F1115"/>
+                <w:kern w:val="0"/>
+                <w:lang w:eastAsia="es-419"/>
+                <w14:ligatures w14:val="none"/>
+              </w:rPr>
+              <w:t>Al guardar cambios, debe mostrar mensaje de confirmación.</w:t>
+            </w:r>
+          </w:p>
+          <w:p>
+            <w:pPr>
+              <w:pStyle w:val="Prrafodelista"/>
+              <w:numPr>
+                <w:ilvl w:val="0"/>
+                <w:numId w:val="22"/>
+              </w:numPr>
+            </w:pPr>
+            <w:r>
+              <w:rPr>
+                <w:rFonts w:ascii="Segoe UI" w:eastAsia="Times New Roman" w:hAnsi="Segoe UI" w:cs="Segoe UI"/>
+                <w:color w:val="0F1115"/>
+                <w:kern w:val="0"/>
+                <w:lang w:eastAsia="es-419"/>
+                <w14:ligatures w14:val="none"/>
+              </w:rPr>
+              <w:t>Debe registrar un historial de cambios (quién, cuándo y qué modificó).</w:t>
+            </w:r>
+          </w:p>
+          <w:p>
+            <w:pPr>
+              <w:pStyle w:val="Prrafodelista"/>
+              <w:numPr>
+                <w:ilvl w:val="0"/>
+                <w:numId w:val="22"/>
+              </w:numPr>
+            </w:pPr>
+            <w:r>
+              <w:rPr>
+                <w:rFonts w:ascii="Segoe UI" w:eastAsia="Times New Roman" w:hAnsi="Segoe UI" w:cs="Segoe UI"/>
+                <w:color w:val="0F1115"/>
+                <w:kern w:val="0"/>
+                <w:lang w:eastAsia="es-419"/>
+                <w14:ligatures w14:val="none"/>
+              </w:rPr>
+              <w:t>Si el correo o NIT están duplicados, debe mostrar mensaje de error.</w:t>
+            </w:r>
+          </w:p>
+          <w:p>
+            <w:pPr>
+              <w:pStyle w:val="Prrafodelista"/>
+              <w:numPr>
+                <w:ilvl w:val="0"/>
+                <w:numId w:val="22"/>
+              </w:numPr>
+            </w:pPr>
+            <w:r>
+              <w:rPr>
+                <w:rFonts w:ascii="Segoe UI" w:eastAsia="Times New Roman" w:hAnsi="Segoe UI" w:cs="Segoe UI"/>
+                <w:color w:val="0F1115"/>
+                <w:kern w:val="0"/>
+                <w:lang w:eastAsia="es-419"/>
+                <w14:ligatures w14:val="none"/>
+              </w:rPr>
+              <w:t>La actualización debe completarse en menos de 2 segundos.</w:t>
+            </w:r>
+          </w:p>
+          <w:p>
+            <w:pPr>
+              <w:pStyle w:val="Prrafodelista"/>
+              <w:numPr>
+                <w:ilvl w:val="0"/>
+                <w:numId w:val="22"/>
+              </w:numPr>
+            </w:pPr>
+            <w:r>
+              <w:rPr>
+                <w:rFonts w:ascii="Segoe UI" w:eastAsia="Times New Roman" w:hAnsi="Segoe UI" w:cs="Segoe UI"/>
+                <w:color w:val="0F1115"/>
+                <w:kern w:val="0"/>
+                <w:lang w:eastAsia="es-419"/>
+                <w14:ligatures w14:val="none"/>
+              </w:rPr>
+              <w:t>Los datos deben almacenarse de forma segura.</w:t>
+            </w:r>
+          </w:p>
+          <w:p>
+            <w:pPr>
+              <w:pStyle w:val="Prrafodelista"/>
+              <w:numPr>
+                <w:ilvl w:val="0"/>
+                <w:numId w:val="22"/>
+              </w:numPr>
+            </w:pPr>
+            <w:r>
+              <w:rPr>
+                <w:rFonts w:ascii="Segoe UI" w:eastAsia="Times New Roman" w:hAnsi="Segoe UI" w:cs="Segoe UI"/>
+                <w:color w:val="0F1115"/>
+                <w:kern w:val="0"/>
+                <w:lang w:eastAsia="es-419"/>
+                <w14:ligatures w14:val="none"/>
+              </w:rPr>
+              <w:t>La interfaz debe ser clara y accesible en dispositivos móviles y web.</w:t>
+            </w:r>
+          </w:p>
+        </w:tc>
+      </w:tr>
+      <w:tr>
+        <w:tc>
+          <w:tcPr>
+            <w:tcW w:w="1980" w:type="dxa"/>
+          </w:tcPr>
+          <w:p>
+            <w:pPr>
+              <w:rPr>
+                <w:b/>
+                <w:bCs/>
+              </w:rPr>
+            </w:pPr>
+            <w:r>
+              <w:rPr>
+                <w:b/>
+                <w:bCs/>
+              </w:rPr>
+              <w:t>PRIORIDAD</w:t>
+            </w:r>
+          </w:p>
+        </w:tc>
+        <w:tc>
+          <w:tcPr>
+            <w:tcW w:w="6848" w:type="dxa"/>
+          </w:tcPr>
+          <w:p>
+            <w:r>
+              <w:t xml:space="preserve">Alta </w:t>
+            </w:r>
+          </w:p>
+        </w:tc>
+      </w:tr>
+      <w:tr>
+        <w:tc>
+          <w:tcPr>
+            <w:tcW w:w="1980" w:type="dxa"/>
+          </w:tcPr>
+          <w:p>
+            <w:pPr>
+              <w:rPr>
+                <w:b/>
+                <w:bCs/>
+              </w:rPr>
+            </w:pPr>
+            <w:r>
+              <w:rPr>
+                <w:b/>
+                <w:bCs/>
+              </w:rPr>
+              <w:t>RF</w:t>
+            </w:r>
+          </w:p>
+        </w:tc>
+        <w:tc>
+          <w:tcPr>
+            <w:tcW w:w="6848" w:type="dxa"/>
+          </w:tcPr>
+          <w:p>
+            <w:r>
+              <w:t>002</w:t>
+            </w:r>
+          </w:p>
+        </w:tc>
+      </w:tr>
+      <w:tr>
+        <w:tc>
+          <w:tcPr>
+            <w:tcW w:w="1980" w:type="dxa"/>
+          </w:tcPr>
+          <w:p>
+            <w:pPr>
+              <w:rPr>
+                <w:b/>
+                <w:bCs/>
+              </w:rPr>
+            </w:pPr>
+            <w:r>
+              <w:rPr>
+                <w:b/>
+                <w:bCs/>
+              </w:rPr>
+              <w:t>RNF</w:t>
+            </w:r>
+          </w:p>
+        </w:tc>
+        <w:tc>
+          <w:tcPr>
+            <w:tcW w:w="6848" w:type="dxa"/>
+          </w:tcPr>
+          <w:p>
+            <w:r>
+              <w:t>002</w:t>
+            </w:r>
+          </w:p>
+        </w:tc>
+      </w:tr>
+    </w:tbl>
+    <w:p>
+      <w:pPr>
+        <w:rPr>
+          <w:b/>
+          <w:bCs/>
+        </w:rPr>
+      </w:pPr>
+    </w:p>
+    <w:p>
+      <w:pPr>
+        <w:rPr>
+          <w:b/>
+          <w:bCs/>
+        </w:rPr>
+      </w:pPr>
+    </w:p>
+    <w:p>
+      <w:pPr>
+        <w:rPr>
+          <w:b/>
+          <w:bCs/>
+        </w:rPr>
+      </w:pPr>
+    </w:p>
+    <w:p>
+      <w:pPr>
+        <w:rPr>
+          <w:b/>
+          <w:bCs/>
+        </w:rPr>
+      </w:pPr>
+    </w:p>
+    <w:p>
+      <w:pPr>
+        <w:rPr>
+          <w:b/>
+          <w:bCs/>
+        </w:rPr>
+      </w:pPr>
+    </w:p>
+    <w:p>
+      <w:pPr>
+        <w:rPr>
+          <w:b/>
+          <w:bCs/>
+        </w:rPr>
+      </w:pPr>
+    </w:p>
+    <w:p>
+      <w:pPr>
+        <w:rPr>
+          <w:b/>
+          <w:bCs/>
+        </w:rPr>
+      </w:pPr>
+    </w:p>
+    <w:p>
+      <w:pPr>
+        <w:rPr>
+          <w:b/>
+          <w:bCs/>
+        </w:rPr>
+      </w:pPr>
+    </w:p>
+    <w:p>
+      <w:pPr>
+        <w:rPr>
+          <w:b/>
+          <w:bCs/>
+        </w:rPr>
+      </w:pPr>
+    </w:p>
+    <w:p>
+      <w:pPr>
+        <w:rPr>
+          <w:b/>
+          <w:bCs/>
+        </w:rPr>
+      </w:pPr>
+    </w:p>
+    <w:p>
+      <w:pPr>
+        <w:rPr>
+          <w:b/>
+          <w:bCs/>
+        </w:rPr>
+      </w:pPr>
+    </w:p>
+    <w:tbl>
+      <w:tblPr>
+        <w:tblStyle w:val="Tablaconcuadrcula"/>
+        <w:tblW w:w="0" w:type="auto"/>
+        <w:tblLook w:val="04A0" w:firstRow="1" w:lastRow="0" w:firstColumn="1" w:lastColumn="0" w:noHBand="0" w:noVBand="1"/>
+      </w:tblPr>
+      <w:tblGrid>
+        <w:gridCol w:w="1980"/>
+        <w:gridCol w:w="6848"/>
+      </w:tblGrid>
+      <w:tr>
+        <w:tc>
+          <w:tcPr>
+            <w:tcW w:w="1980" w:type="dxa"/>
+            <w:tcBorders>
+              <w:top w:val="nil"/>
+              <w:left w:val="nil"/>
+              <w:bottom w:val="single" w:sz="4" w:space="0" w:color="auto"/>
+              <w:right w:val="single" w:sz="4" w:space="0" w:color="auto"/>
+            </w:tcBorders>
+          </w:tcPr>
+          <w:p>
+            <w:pPr>
+              <w:jc w:val="center"/>
+              <w:rPr>
+                <w:b/>
+                <w:bCs/>
+              </w:rPr>
+            </w:pPr>
+          </w:p>
+        </w:tc>
+        <w:tc>
+          <w:tcPr>
+            <w:tcW w:w="6848" w:type="dxa"/>
+            <w:tcBorders>
+              <w:left w:val="single" w:sz="4" w:space="0" w:color="auto"/>
+            </w:tcBorders>
+          </w:tcPr>
+          <w:p>
+            <w:pPr>
+              <w:jc w:val="center"/>
+              <w:rPr>
+                <w:b/>
+                <w:bCs/>
+              </w:rPr>
+            </w:pPr>
+            <w:r>
+              <w:rPr>
+                <w:b/>
+                <w:bCs/>
+              </w:rPr>
+              <w:t>HU 0</w:t>
+            </w:r>
+            <w:r>
+              <w:rPr>
+                <w:b/>
+                <w:bCs/>
+              </w:rPr>
+              <w:t>11</w:t>
+            </w:r>
+          </w:p>
+        </w:tc>
+      </w:tr>
+      <w:tr>
+        <w:tc>
+          <w:tcPr>
+            <w:tcW w:w="1980" w:type="dxa"/>
+            <w:tcBorders>
+              <w:top w:val="single" w:sz="4" w:space="0" w:color="auto"/>
+            </w:tcBorders>
+          </w:tcPr>
+          <w:p>
+            <w:pPr>
+              <w:rPr>
+                <w:b/>
+                <w:bCs/>
+              </w:rPr>
+            </w:pPr>
+            <w:r>
+              <w:rPr>
+                <w:b/>
+                <w:bCs/>
+              </w:rPr>
+              <w:t>NOMBRE</w:t>
+            </w:r>
+          </w:p>
+        </w:tc>
+        <w:tc>
+          <w:tcPr>
+            <w:tcW w:w="6848" w:type="dxa"/>
+          </w:tcPr>
+          <w:p>
+            <w:pPr>
+              <w:rPr>
+                <w:b/>
+                <w:bCs/>
+              </w:rPr>
+            </w:pPr>
+            <w:r>
+              <w:rPr>
+                <w:b/>
+                <w:bCs/>
+              </w:rPr>
+              <w:t>Eliminar organización</w:t>
+            </w:r>
+          </w:p>
+        </w:tc>
+      </w:tr>
+      <w:tr>
+        <w:tc>
+          <w:tcPr>
+            <w:tcW w:w="1980" w:type="dxa"/>
+          </w:tcPr>
+          <w:p>
+            <w:pPr>
+              <w:rPr>
+                <w:b/>
+                <w:bCs/>
+              </w:rPr>
+            </w:pPr>
+            <w:r>
+              <w:rPr>
+                <w:b/>
+                <w:bCs/>
+              </w:rPr>
+              <w:t xml:space="preserve">DESCRPCION </w:t>
+            </w:r>
+          </w:p>
+        </w:tc>
+        <w:tc>
+          <w:tcPr>
+            <w:tcW w:w="6848" w:type="dxa"/>
+          </w:tcPr>
+          <w:p>
+            <w:r>
+              <w:rPr>
+                <w:b/>
+                <w:bCs/>
+              </w:rPr>
+              <w:t>Como </w:t>
+            </w:r>
+            <w:r>
+              <w:t>administrador del sistema, </w:t>
+            </w:r>
+            <w:r>
+              <w:rPr>
+                <w:b/>
+                <w:bCs/>
+              </w:rPr>
+              <w:t>quiero</w:t>
+            </w:r>
+            <w:r>
+              <w:t> poder eliminar una organización de la plataforma,</w:t>
+            </w:r>
+            <w:r>
+              <w:rPr>
+                <w:b/>
+                <w:bCs/>
+              </w:rPr>
+              <w:t> para </w:t>
+            </w:r>
+            <w:r>
+              <w:t>retirar organizaciones inactivas, duplicadas o que ya no cumplen con los requisitos del sistema.</w:t>
+            </w:r>
+          </w:p>
+        </w:tc>
+      </w:tr>
+      <w:tr>
+        <w:tc>
+          <w:tcPr>
+            <w:tcW w:w="1980" w:type="dxa"/>
+          </w:tcPr>
+          <w:p>
+            <w:pPr>
+              <w:rPr>
+                <w:b/>
+                <w:bCs/>
+              </w:rPr>
+            </w:pPr>
+            <w:r>
+              <w:rPr>
+                <w:b/>
+                <w:bCs/>
+              </w:rPr>
+              <w:t>CRITERIOS DE</w:t>
+            </w:r>
+          </w:p>
+          <w:p>
+            <w:pPr>
+              <w:rPr>
+                <w:b/>
+                <w:bCs/>
+              </w:rPr>
+            </w:pPr>
+            <w:r>
+              <w:rPr>
+                <w:b/>
+                <w:bCs/>
+              </w:rPr>
+              <w:t>EVALUACIÓN</w:t>
+            </w:r>
+          </w:p>
+        </w:tc>
+        <w:tc>
+          <w:tcPr>
+            <w:tcW w:w="6848" w:type="dxa"/>
+          </w:tcPr>
+          <w:p>
+            <w:pPr>
+              <w:pStyle w:val="Prrafodelista"/>
+              <w:numPr>
+                <w:ilvl w:val="0"/>
+                <w:numId w:val="23"/>
+              </w:numPr>
+            </w:pPr>
+            <w:r>
+              <w:rPr>
+                <w:rFonts w:ascii="Segoe UI" w:eastAsia="Times New Roman" w:hAnsi="Segoe UI" w:cs="Segoe UI"/>
+                <w:color w:val="0F1115"/>
+                <w:kern w:val="0"/>
+                <w:lang w:eastAsia="es-419"/>
+                <w14:ligatures w14:val="none"/>
+              </w:rPr>
+              <w:t>Solo el administrador general puede eliminar organizaciones.</w:t>
+            </w:r>
+          </w:p>
+          <w:p>
+            <w:pPr>
+              <w:pStyle w:val="Prrafodelista"/>
+              <w:numPr>
+                <w:ilvl w:val="0"/>
+                <w:numId w:val="23"/>
+              </w:numPr>
+            </w:pPr>
+            <w:r>
+              <w:rPr>
+                <w:rFonts w:ascii="Segoe UI" w:eastAsia="Times New Roman" w:hAnsi="Segoe UI" w:cs="Segoe UI"/>
+                <w:color w:val="0F1115"/>
+                <w:kern w:val="0"/>
+                <w:lang w:eastAsia="es-419"/>
+                <w14:ligatures w14:val="none"/>
+              </w:rPr>
+              <w:t>Antes de eliminar, debe solicitar confirmación (mensaje de advertencia).</w:t>
+            </w:r>
+          </w:p>
+          <w:p>
+            <w:pPr>
+              <w:pStyle w:val="Prrafodelista"/>
+              <w:numPr>
+                <w:ilvl w:val="0"/>
+                <w:numId w:val="23"/>
+              </w:numPr>
+            </w:pPr>
+            <w:r>
+              <w:rPr>
+                <w:rFonts w:ascii="Segoe UI" w:eastAsia="Times New Roman" w:hAnsi="Segoe UI" w:cs="Segoe UI"/>
+                <w:color w:val="0F1115"/>
+                <w:kern w:val="0"/>
+                <w:lang w:eastAsia="es-419"/>
+                <w14:ligatures w14:val="none"/>
+              </w:rPr>
+              <w:t>Al eliminar, se debe preguntar si también se desea eliminar los usuarios asociados o transferirlos.</w:t>
+            </w:r>
+          </w:p>
+          <w:p>
+            <w:pPr>
+              <w:pStyle w:val="Prrafodelista"/>
+              <w:numPr>
+                <w:ilvl w:val="0"/>
+                <w:numId w:val="23"/>
+              </w:numPr>
+            </w:pPr>
+            <w:r>
+              <w:rPr>
+                <w:rFonts w:ascii="Segoe UI" w:eastAsia="Times New Roman" w:hAnsi="Segoe UI" w:cs="Segoe UI"/>
+                <w:color w:val="0F1115"/>
+                <w:kern w:val="0"/>
+                <w:lang w:eastAsia="es-419"/>
+                <w14:ligatures w14:val="none"/>
+              </w:rPr>
+              <w:t>Se debe generar un registro de auditoría de la eliminación (quién, cuándo y motivo).</w:t>
+            </w:r>
+          </w:p>
+          <w:p>
+            <w:pPr>
+              <w:pStyle w:val="Prrafodelista"/>
+              <w:numPr>
+                <w:ilvl w:val="0"/>
+                <w:numId w:val="23"/>
+              </w:numPr>
+            </w:pPr>
+            <w:r>
+              <w:rPr>
+                <w:rFonts w:ascii="Segoe UI" w:eastAsia="Times New Roman" w:hAnsi="Segoe UI" w:cs="Segoe UI"/>
+                <w:color w:val="0F1115"/>
+                <w:kern w:val="0"/>
+                <w:lang w:eastAsia="es-419"/>
+                <w14:ligatures w14:val="none"/>
+              </w:rPr>
+              <w:t>Si la organización tiene solicitudes o proyectos activos, debe mostrar advertencia.</w:t>
+            </w:r>
+          </w:p>
+          <w:p>
+            <w:pPr>
+              <w:pStyle w:val="Prrafodelista"/>
+              <w:numPr>
+                <w:ilvl w:val="0"/>
+                <w:numId w:val="23"/>
+              </w:numPr>
+            </w:pPr>
+            <w:r>
+              <w:rPr>
+                <w:rFonts w:ascii="Segoe UI" w:eastAsia="Times New Roman" w:hAnsi="Segoe UI" w:cs="Segoe UI"/>
+                <w:color w:val="0F1115"/>
+                <w:kern w:val="0"/>
+                <w:lang w:eastAsia="es-419"/>
+                <w14:ligatures w14:val="none"/>
+              </w:rPr>
+              <w:t>La eliminación debe completarse en menos de 2 segundos.</w:t>
+            </w:r>
+          </w:p>
+          <w:p>
+            <w:pPr>
+              <w:pStyle w:val="Prrafodelista"/>
+              <w:numPr>
+                <w:ilvl w:val="0"/>
+                <w:numId w:val="23"/>
+              </w:numPr>
+            </w:pPr>
+            <w:r>
+              <w:rPr>
+                <w:rFonts w:ascii="Segoe UI" w:eastAsia="Times New Roman" w:hAnsi="Segoe UI" w:cs="Segoe UI"/>
+                <w:color w:val="0F1115"/>
+                <w:kern w:val="0"/>
+                <w:lang w:eastAsia="es-419"/>
+                <w14:ligatures w14:val="none"/>
+              </w:rPr>
+              <w:t>Después de eliminar, redirigir al listado de organizaciones.</w:t>
+            </w:r>
+          </w:p>
+          <w:p>
+            <w:pPr>
+              <w:pStyle w:val="Prrafodelista"/>
+              <w:numPr>
+                <w:ilvl w:val="0"/>
+                <w:numId w:val="23"/>
+              </w:numPr>
+            </w:pPr>
+            <w:r>
+              <w:rPr>
+                <w:rFonts w:ascii="Segoe UI" w:eastAsia="Times New Roman" w:hAnsi="Segoe UI" w:cs="Segoe UI"/>
+                <w:color w:val="0F1115"/>
+                <w:kern w:val="0"/>
+                <w:lang w:eastAsia="es-419"/>
+                <w14:ligatures w14:val="none"/>
+              </w:rPr>
+              <w:t>La interfaz debe ser clara y accesible en dispositivos móviles y web.</w:t>
+            </w:r>
+          </w:p>
+        </w:tc>
+      </w:tr>
+      <w:tr>
+        <w:tc>
+          <w:tcPr>
+            <w:tcW w:w="1980" w:type="dxa"/>
+          </w:tcPr>
+          <w:p>
+            <w:pPr>
+              <w:rPr>
+                <w:b/>
+                <w:bCs/>
+              </w:rPr>
+            </w:pPr>
+            <w:r>
+              <w:rPr>
+                <w:b/>
+                <w:bCs/>
+              </w:rPr>
+              <w:t>PRIORIDAD</w:t>
+            </w:r>
+          </w:p>
+        </w:tc>
+        <w:tc>
+          <w:tcPr>
+            <w:tcW w:w="6848" w:type="dxa"/>
+          </w:tcPr>
+          <w:p>
+            <w:r>
+              <w:t xml:space="preserve">Media </w:t>
+            </w:r>
+          </w:p>
+        </w:tc>
+      </w:tr>
+      <w:tr>
+        <w:tc>
+          <w:tcPr>
+            <w:tcW w:w="1980" w:type="dxa"/>
+          </w:tcPr>
+          <w:p>
+            <w:pPr>
+              <w:rPr>
+                <w:b/>
+                <w:bCs/>
+              </w:rPr>
+            </w:pPr>
+            <w:r>
+              <w:rPr>
+                <w:b/>
+                <w:bCs/>
+              </w:rPr>
+              <w:t>RF</w:t>
+            </w:r>
+          </w:p>
+        </w:tc>
+        <w:tc>
+          <w:tcPr>
+            <w:tcW w:w="6848" w:type="dxa"/>
+          </w:tcPr>
+          <w:p>
+            <w:r>
+              <w:t>003</w:t>
+            </w:r>
+          </w:p>
+        </w:tc>
+      </w:tr>
+      <w:tr>
+        <w:tc>
+          <w:tcPr>
+            <w:tcW w:w="1980" w:type="dxa"/>
+          </w:tcPr>
+          <w:p>
+            <w:pPr>
+              <w:rPr>
+                <w:b/>
+                <w:bCs/>
+              </w:rPr>
+            </w:pPr>
+            <w:r>
+              <w:rPr>
+                <w:b/>
+                <w:bCs/>
+              </w:rPr>
+              <w:t>RNF</w:t>
+            </w:r>
+          </w:p>
+        </w:tc>
+        <w:tc>
+          <w:tcPr>
+            <w:tcW w:w="6848" w:type="dxa"/>
+          </w:tcPr>
+          <w:p>
+            <w:r>
+              <w:t>003</w:t>
+            </w:r>
+          </w:p>
+        </w:tc>
+      </w:tr>
+    </w:tbl>
+    <w:p>
+      <w:pPr>
+        <w:rPr>
+          <w:b/>
+          <w:bCs/>
+        </w:rPr>
+      </w:pPr>
+    </w:p>
+    <w:p>
+      <w:pPr>
+        <w:rPr>
+          <w:b/>
+          <w:bCs/>
+        </w:rPr>
+      </w:pPr>
+    </w:p>
+    <w:p>
+      <w:pPr>
+        <w:rPr>
+          <w:b/>
+          <w:bCs/>
+        </w:rPr>
+      </w:pPr>
+    </w:p>
+    <w:p>
+      <w:pPr>
+        <w:rPr>
+          <w:b/>
+          <w:bCs/>
+        </w:rPr>
+      </w:pPr>
+    </w:p>
+    <w:p>
+      <w:pPr>
+        <w:rPr>
+          <w:b/>
+          <w:bCs/>
+        </w:rPr>
+      </w:pPr>
+    </w:p>
+    <w:p>
+      <w:pPr>
+        <w:rPr>
+          <w:b/>
+          <w:bCs/>
+        </w:rPr>
+      </w:pPr>
+    </w:p>
+    <w:p>
+      <w:pPr>
+        <w:rPr>
+          <w:b/>
+          <w:bCs/>
+        </w:rPr>
+      </w:pPr>
+    </w:p>
+    <w:p>
+      <w:pPr>
+        <w:rPr>
+          <w:b/>
+          <w:bCs/>
+        </w:rPr>
+      </w:pPr>
+    </w:p>
+    <w:p>
+      <w:pPr>
+        <w:rPr>
+          <w:b/>
+          <w:bCs/>
+        </w:rPr>
+      </w:pPr>
+    </w:p>
+    <w:tbl>
+      <w:tblPr>
+        <w:tblStyle w:val="Tablaconcuadrcula"/>
+        <w:tblW w:w="0" w:type="auto"/>
+        <w:tblLook w:val="04A0" w:firstRow="1" w:lastRow="0" w:firstColumn="1" w:lastColumn="0" w:noHBand="0" w:noVBand="1"/>
+      </w:tblPr>
+      <w:tblGrid>
+        <w:gridCol w:w="1980"/>
+        <w:gridCol w:w="6848"/>
+      </w:tblGrid>
+      <w:tr>
+        <w:tc>
+          <w:tcPr>
+            <w:tcW w:w="1980" w:type="dxa"/>
+            <w:tcBorders>
+              <w:top w:val="nil"/>
+              <w:left w:val="nil"/>
+              <w:bottom w:val="single" w:sz="4" w:space="0" w:color="auto"/>
+              <w:right w:val="single" w:sz="4" w:space="0" w:color="auto"/>
+            </w:tcBorders>
+          </w:tcPr>
+          <w:p>
+            <w:pPr>
+              <w:jc w:val="center"/>
+              <w:rPr>
+                <w:b/>
+                <w:bCs/>
+              </w:rPr>
+            </w:pPr>
+          </w:p>
+        </w:tc>
+        <w:tc>
+          <w:tcPr>
+            <w:tcW w:w="6848" w:type="dxa"/>
+            <w:tcBorders>
+              <w:left w:val="single" w:sz="4" w:space="0" w:color="auto"/>
+            </w:tcBorders>
+          </w:tcPr>
+          <w:p>
+            <w:pPr>
+              <w:jc w:val="center"/>
+              <w:rPr>
+                <w:b/>
+                <w:bCs/>
+              </w:rPr>
+            </w:pPr>
+            <w:r>
+              <w:rPr>
+                <w:b/>
+                <w:bCs/>
+              </w:rPr>
+              <w:t>HU 0</w:t>
+            </w:r>
+            <w:r>
+              <w:rPr>
+                <w:b/>
+                <w:bCs/>
+              </w:rPr>
+              <w:t>12</w:t>
+            </w:r>
+          </w:p>
+        </w:tc>
+      </w:tr>
+      <w:tr>
+        <w:tc>
+          <w:tcPr>
+            <w:tcW w:w="1980" w:type="dxa"/>
+            <w:tcBorders>
+              <w:top w:val="single" w:sz="4" w:space="0" w:color="auto"/>
+            </w:tcBorders>
+          </w:tcPr>
+          <w:p>
+            <w:pPr>
+              <w:rPr>
+                <w:b/>
+                <w:bCs/>
+              </w:rPr>
+            </w:pPr>
+            <w:r>
+              <w:rPr>
+                <w:b/>
+                <w:bCs/>
+              </w:rPr>
+              <w:t>NOMBRE</w:t>
+            </w:r>
+          </w:p>
+        </w:tc>
+        <w:tc>
+          <w:tcPr>
+            <w:tcW w:w="6848" w:type="dxa"/>
+          </w:tcPr>
+          <w:p>
+            <w:pPr>
+              <w:rPr>
+                <w:b/>
+                <w:bCs/>
+              </w:rPr>
+            </w:pPr>
+            <w:r>
+              <w:rPr>
+                <w:b/>
+                <w:bCs/>
+              </w:rPr>
+              <w:t>Consultar</w:t>
+            </w:r>
+            <w:r>
+              <w:rPr>
+                <w:b/>
+                <w:bCs/>
+              </w:rPr>
+              <w:t xml:space="preserve"> </w:t>
+            </w:r>
+            <w:r>
+              <w:rPr>
+                <w:b/>
+                <w:bCs/>
+              </w:rPr>
+              <w:t>organizaciones</w:t>
+            </w:r>
+          </w:p>
+        </w:tc>
+      </w:tr>
+      <w:tr>
+        <w:tc>
+          <w:tcPr>
+            <w:tcW w:w="1980" w:type="dxa"/>
+          </w:tcPr>
+          <w:p>
+            <w:pPr>
+              <w:rPr>
+                <w:b/>
+                <w:bCs/>
+              </w:rPr>
+            </w:pPr>
+            <w:r>
+              <w:rPr>
+                <w:b/>
+                <w:bCs/>
+              </w:rPr>
+              <w:t xml:space="preserve">DESCRPCION </w:t>
+            </w:r>
+          </w:p>
+        </w:tc>
+        <w:tc>
+          <w:tcPr>
+            <w:tcW w:w="6848" w:type="dxa"/>
+          </w:tcPr>
+          <w:p>
+            <w:r>
+              <w:rPr>
+                <w:b/>
+                <w:bCs/>
+              </w:rPr>
+              <w:t>Como </w:t>
+            </w:r>
+            <w:r>
+              <w:t>usuario del sistema (Solicitante, Voluntario, Organización o Administrador),</w:t>
+            </w:r>
+            <w:r>
+              <w:rPr>
+                <w:b/>
+                <w:bCs/>
+              </w:rPr>
+              <w:t> </w:t>
+            </w:r>
+            <w:r>
+              <w:rPr>
+                <w:b/>
+                <w:bCs/>
+              </w:rPr>
+              <w:t>quiero</w:t>
+            </w:r>
+            <w:r>
+              <w:t> poder consultar el listado de organizaciones registradas,</w:t>
+            </w:r>
+            <w:r>
+              <w:rPr>
+                <w:b/>
+                <w:bCs/>
+              </w:rPr>
+              <w:t> para </w:t>
+            </w:r>
+            <w:r>
+              <w:t>conocerlas y visualizar su información básica.</w:t>
+            </w:r>
+          </w:p>
+        </w:tc>
+      </w:tr>
+      <w:tr>
+        <w:tc>
+          <w:tcPr>
+            <w:tcW w:w="1980" w:type="dxa"/>
+          </w:tcPr>
+          <w:p>
+            <w:pPr>
+              <w:rPr>
+                <w:b/>
+                <w:bCs/>
+              </w:rPr>
+            </w:pPr>
+            <w:r>
+              <w:rPr>
+                <w:b/>
+                <w:bCs/>
+              </w:rPr>
+              <w:t>CRITERIOS DE</w:t>
+            </w:r>
+          </w:p>
+          <w:p>
+            <w:pPr>
+              <w:rPr>
+                <w:b/>
+                <w:bCs/>
+              </w:rPr>
+            </w:pPr>
+            <w:r>
+              <w:rPr>
+                <w:b/>
+                <w:bCs/>
+              </w:rPr>
+              <w:t>EVALUACIÓN</w:t>
+            </w:r>
+          </w:p>
+        </w:tc>
+        <w:tc>
+          <w:tcPr>
+            <w:tcW w:w="6848" w:type="dxa"/>
+          </w:tcPr>
+          <w:p>
+            <w:pPr>
+              <w:pStyle w:val="Prrafodelista"/>
+              <w:numPr>
+                <w:ilvl w:val="0"/>
+                <w:numId w:val="24"/>
+              </w:numPr>
+            </w:pPr>
+            <w:r>
+              <w:rPr>
+                <w:rFonts w:ascii="Segoe UI" w:eastAsia="Times New Roman" w:hAnsi="Segoe UI" w:cs="Segoe UI"/>
+                <w:color w:val="0F1115"/>
+                <w:kern w:val="0"/>
+                <w:lang w:eastAsia="es-419"/>
+                <w14:ligatures w14:val="none"/>
+              </w:rPr>
+              <w:t>El sistema debe mostrar un listado de organizaciones con campos: nombre</w:t>
+            </w:r>
+            <w:r>
+              <w:rPr>
+                <w:rFonts w:ascii="Segoe UI" w:eastAsia="Times New Roman" w:hAnsi="Segoe UI" w:cs="Segoe UI"/>
+                <w:color w:val="0F1115"/>
+                <w:kern w:val="0"/>
+                <w:lang w:eastAsia="es-419"/>
+                <w14:ligatures w14:val="none"/>
+              </w:rPr>
+              <w:t xml:space="preserve"> </w:t>
+            </w:r>
+            <w:r>
+              <w:rPr>
+                <w:rFonts w:ascii="Segoe UI" w:eastAsia="Times New Roman" w:hAnsi="Segoe UI" w:cs="Segoe UI"/>
+                <w:color w:val="0F1115"/>
+                <w:kern w:val="0"/>
+                <w:lang w:eastAsia="es-419"/>
+                <w14:ligatures w14:val="none"/>
+              </w:rPr>
+              <w:t>y estado (activa/inactiva).</w:t>
+            </w:r>
+          </w:p>
+          <w:p>
+            <w:pPr>
+              <w:pStyle w:val="Prrafodelista"/>
+              <w:numPr>
+                <w:ilvl w:val="0"/>
+                <w:numId w:val="24"/>
+              </w:numPr>
+            </w:pPr>
+            <w:r>
+              <w:rPr>
+                <w:rFonts w:ascii="Segoe UI" w:eastAsia="Times New Roman" w:hAnsi="Segoe UI" w:cs="Segoe UI"/>
+                <w:color w:val="0F1115"/>
+                <w:kern w:val="0"/>
+                <w:lang w:eastAsia="es-419"/>
+                <w14:ligatures w14:val="none"/>
+              </w:rPr>
+              <w:t>Debe permitir buscar por nombre</w:t>
+            </w:r>
+            <w:r>
+              <w:rPr>
+                <w:rFonts w:ascii="Segoe UI" w:eastAsia="Times New Roman" w:hAnsi="Segoe UI" w:cs="Segoe UI"/>
+                <w:color w:val="0F1115"/>
+                <w:kern w:val="0"/>
+                <w:lang w:eastAsia="es-419"/>
+                <w14:ligatures w14:val="none"/>
+              </w:rPr>
+              <w:t xml:space="preserve"> o</w:t>
+            </w:r>
+            <w:r>
+              <w:rPr>
+                <w:rFonts w:ascii="Segoe UI" w:eastAsia="Times New Roman" w:hAnsi="Segoe UI" w:cs="Segoe UI"/>
+                <w:color w:val="0F1115"/>
+                <w:kern w:val="0"/>
+                <w:lang w:eastAsia="es-419"/>
+                <w14:ligatures w14:val="none"/>
+              </w:rPr>
+              <w:t xml:space="preserve"> NIT.</w:t>
+            </w:r>
+          </w:p>
+          <w:p>
+            <w:pPr>
+              <w:pStyle w:val="Prrafodelista"/>
+              <w:numPr>
+                <w:ilvl w:val="0"/>
+                <w:numId w:val="24"/>
+              </w:numPr>
+            </w:pPr>
+            <w:r>
+              <w:rPr>
+                <w:rFonts w:ascii="Segoe UI" w:eastAsia="Times New Roman" w:hAnsi="Segoe UI" w:cs="Segoe UI"/>
+                <w:color w:val="0F1115"/>
+                <w:kern w:val="0"/>
+                <w:lang w:eastAsia="es-419"/>
+                <w14:ligatures w14:val="none"/>
+              </w:rPr>
+              <w:t>A</w:t>
+            </w:r>
+            <w:r>
+              <w:rPr>
+                <w:rFonts w:ascii="Segoe UI" w:eastAsia="Times New Roman" w:hAnsi="Segoe UI" w:cs="Segoe UI"/>
+                <w:color w:val="0F1115"/>
+                <w:kern w:val="0"/>
+                <w:lang w:eastAsia="es-419"/>
+                <w14:ligatures w14:val="none"/>
+              </w:rPr>
+              <w:t>l seleccionar una organización, debe mostrar el detalle completo: nombre, NIT, dirección, correo, descripción, logo, fecha de registro y estado.</w:t>
+            </w:r>
+          </w:p>
+          <w:p>
+            <w:pPr>
+              <w:pStyle w:val="Prrafodelista"/>
+              <w:numPr>
+                <w:ilvl w:val="0"/>
+                <w:numId w:val="24"/>
+              </w:numPr>
+            </w:pPr>
+            <w:r>
+              <w:rPr>
+                <w:rFonts w:ascii="Segoe UI" w:eastAsia="Times New Roman" w:hAnsi="Segoe UI" w:cs="Segoe UI"/>
+                <w:color w:val="0F1115"/>
+                <w:kern w:val="0"/>
+                <w:lang w:eastAsia="es-419"/>
+                <w14:ligatures w14:val="none"/>
+              </w:rPr>
+              <w:t>Los datos deben cargarse en menos de 2 segundos.</w:t>
+            </w:r>
+          </w:p>
+          <w:p>
+            <w:pPr>
+              <w:pStyle w:val="Prrafodelista"/>
+              <w:numPr>
+                <w:ilvl w:val="0"/>
+                <w:numId w:val="24"/>
+              </w:numPr>
+            </w:pPr>
+            <w:r>
+              <w:rPr>
+                <w:rFonts w:ascii="Segoe UI" w:eastAsia="Times New Roman" w:hAnsi="Segoe UI" w:cs="Segoe UI"/>
+                <w:color w:val="0F1115"/>
+                <w:kern w:val="0"/>
+                <w:lang w:eastAsia="es-419"/>
+                <w14:ligatures w14:val="none"/>
+              </w:rPr>
+              <w:t>La interfaz debe ser responsiva y accesible en móviles y web.</w:t>
+            </w:r>
+          </w:p>
+          <w:p>
+            <w:pPr>
+              <w:pStyle w:val="Prrafodelista"/>
+              <w:numPr>
+                <w:ilvl w:val="0"/>
+                <w:numId w:val="24"/>
+              </w:numPr>
+            </w:pPr>
+            <w:r>
+              <w:rPr>
+                <w:rFonts w:ascii="Segoe UI" w:eastAsia="Times New Roman" w:hAnsi="Segoe UI" w:cs="Segoe UI"/>
+                <w:color w:val="0F1115"/>
+                <w:kern w:val="0"/>
+                <w:lang w:eastAsia="es-419"/>
+                <w14:ligatures w14:val="none"/>
+              </w:rPr>
+              <w:t>Debe incluir paginación si hay más de 20 organizaciones.</w:t>
+            </w:r>
+          </w:p>
+          <w:p>
+            <w:pPr>
+              <w:pStyle w:val="Prrafodelista"/>
+              <w:numPr>
+                <w:ilvl w:val="0"/>
+                <w:numId w:val="24"/>
+              </w:numPr>
+            </w:pPr>
+            <w:r>
+              <w:rPr>
+                <w:rFonts w:ascii="Segoe UI" w:eastAsia="Times New Roman" w:hAnsi="Segoe UI" w:cs="Segoe UI"/>
+                <w:color w:val="0F1115"/>
+                <w:kern w:val="0"/>
+                <w:lang w:eastAsia="es-419"/>
+                <w14:ligatures w14:val="none"/>
+              </w:rPr>
+              <w:t>Los solicitantes y voluntarios solo deben ver organizaciones activas.</w:t>
+            </w:r>
+          </w:p>
+        </w:tc>
+      </w:tr>
+      <w:tr>
+        <w:tc>
+          <w:tcPr>
+            <w:tcW w:w="1980" w:type="dxa"/>
+          </w:tcPr>
+          <w:p>
+            <w:pPr>
+              <w:rPr>
+                <w:b/>
+                <w:bCs/>
+              </w:rPr>
+            </w:pPr>
+            <w:r>
+              <w:rPr>
+                <w:b/>
+                <w:bCs/>
+              </w:rPr>
+              <w:t>PRIORIDAD</w:t>
+            </w:r>
+          </w:p>
+        </w:tc>
+        <w:tc>
+          <w:tcPr>
+            <w:tcW w:w="6848" w:type="dxa"/>
+          </w:tcPr>
+          <w:p>
+            <w:r>
+              <w:t xml:space="preserve">Alta </w:t>
+            </w:r>
+          </w:p>
+        </w:tc>
+      </w:tr>
+      <w:tr>
+        <w:tc>
+          <w:tcPr>
+            <w:tcW w:w="1980" w:type="dxa"/>
+          </w:tcPr>
+          <w:p>
+            <w:pPr>
+              <w:rPr>
+                <w:b/>
+                <w:bCs/>
+              </w:rPr>
+            </w:pPr>
+            <w:r>
+              <w:rPr>
+                <w:b/>
+                <w:bCs/>
+              </w:rPr>
+              <w:t>RF</w:t>
+            </w:r>
+          </w:p>
+        </w:tc>
+        <w:tc>
+          <w:tcPr>
+            <w:tcW w:w="6848" w:type="dxa"/>
+          </w:tcPr>
+          <w:p>
+            <w:r>
+              <w:t>00</w:t>
+            </w:r>
+            <w:r>
+              <w:t>4</w:t>
+            </w:r>
+          </w:p>
+        </w:tc>
+      </w:tr>
+      <w:tr>
+        <w:tc>
+          <w:tcPr>
+            <w:tcW w:w="1980" w:type="dxa"/>
+          </w:tcPr>
+          <w:p>
+            <w:pPr>
+              <w:rPr>
+                <w:b/>
+                <w:bCs/>
+              </w:rPr>
+            </w:pPr>
+            <w:r>
+              <w:rPr>
+                <w:b/>
+                <w:bCs/>
+              </w:rPr>
+              <w:t>RNF</w:t>
+            </w:r>
+          </w:p>
+        </w:tc>
+        <w:tc>
+          <w:tcPr>
+            <w:tcW w:w="6848" w:type="dxa"/>
+          </w:tcPr>
+          <w:p>
+            <w:r>
+              <w:t>00</w:t>
+            </w:r>
+            <w:r>
+              <w:t>4</w:t>
+            </w:r>
+          </w:p>
+        </w:tc>
+      </w:tr>
+    </w:tbl>
+    <w:p>
+      <w:pPr>
+        <w:rPr>
+          <w:b/>
+          <w:bCs/>
+        </w:rPr>
+      </w:pPr>
+    </w:p>
+    <w:p>
+      <w:pPr>
+        <w:rPr>
+          <w:b/>
+          <w:bCs/>
+        </w:rPr>
+      </w:pPr>
+    </w:p>
+    <w:p>
+      <w:pPr>
+        <w:rPr>
+          <w:b/>
+          <w:bCs/>
+        </w:rPr>
+      </w:pPr>
+    </w:p>
+    <w:p>
+      <w:pPr>
+        <w:rPr>
+          <w:b/>
+          <w:bCs/>
+        </w:rPr>
+      </w:pPr>
+    </w:p>
+    <w:p>
+      <w:pPr>
+        <w:rPr>
+          <w:b/>
+          <w:bCs/>
+        </w:rPr>
+      </w:pPr>
+    </w:p>
+    <w:p>
+      <w:pPr>
+        <w:rPr>
+          <w:b/>
+          <w:bCs/>
+        </w:rPr>
+      </w:pPr>
+    </w:p>
+    <w:p>
+      <w:pPr>
+        <w:rPr>
+          <w:b/>
+          <w:bCs/>
+        </w:rPr>
+      </w:pPr>
+    </w:p>
     <w:p>
       <w:pPr>
         <w:rPr>
@@ -5598,6 +7353,9 @@
     </w:tbl>
     <w:p/>
     <w:p/>
+    <w:p/>
+    <w:p/>
+    <w:p/>
     <w:tbl>
       <w:tblPr>
         <w:tblStyle w:val="Tablaconcuadrcula"/>
@@ -5738,11 +7496,7 @@
               <w:t xml:space="preserve"> (en caso del voluntario este mira las que ha realizado) </w:t>
             </w:r>
             <w:r>
-              <w:t xml:space="preserve">en la </w:t>
-            </w:r>
-            <w:r>
-              <w:lastRenderedPageBreak/>
-              <w:t>plataforma para visualizar la información disponible y realizar el seguimiento de las donaciones</w:t>
+              <w:t>en la plataforma para visualizar la información disponible y realizar el seguimiento de las donaciones</w:t>
             </w:r>
             <w:r>
               <w:t>.</w:t>
@@ -5767,7 +7521,6 @@
                 <w:b/>
                 <w:bCs/>
               </w:rPr>
-              <w:lastRenderedPageBreak/>
               <w:t>CRITERIOS DE</w:t>
             </w:r>
           </w:p>
@@ -6157,7 +7910,23 @@
               </w:numPr>
             </w:pPr>
             <w:r>
-              <w:t>El sistema debe mostrar los métodos de pago disponibles (PSE, bancos, Nequi, Daviplata, entre otros).</w:t>
+              <w:t xml:space="preserve">El sistema debe mostrar los métodos de pago disponibles (PSE, bancos, </w:t>
+            </w:r>
+            <w:proofErr w:type="spellStart"/>
+            <w:r>
+              <w:t>Nequi</w:t>
+            </w:r>
+            <w:proofErr w:type="spellEnd"/>
+            <w:r>
+              <w:t xml:space="preserve">, </w:t>
+            </w:r>
+            <w:proofErr w:type="spellStart"/>
+            <w:r>
+              <w:t>Daviplata</w:t>
+            </w:r>
+            <w:proofErr w:type="spellEnd"/>
+            <w:r>
+              <w:t>, entre otros).</w:t>
             </w:r>
           </w:p>
           <w:p>
@@ -6701,6 +8470,95 @@
     </w:lvl>
   </w:abstractNum>
   <w:abstractNum w:abstractNumId="4" w15:restartNumberingAfterBreak="0">
+    <w:nsid w:val="12224B05"/>
+    <w:multiLevelType w:val="hybridMultilevel"/>
+    <w:tmpl w:val="5F129616"/>
+    <w:lvl w:ilvl="0" w:tplc="FFFFFFFF">
+      <w:start w:val="1"/>
+      <w:numFmt w:val="decimal"/>
+      <w:lvlText w:val="%1."/>
+      <w:lvlJc w:val="left"/>
+      <w:pPr>
+        <w:ind w:left="720" w:hanging="360"/>
+      </w:pPr>
+      <w:rPr>
+        <w:rFonts w:hint="default"/>
+      </w:rPr>
+    </w:lvl>
+    <w:lvl w:ilvl="1" w:tplc="FFFFFFFF" w:tentative="1">
+      <w:start w:val="1"/>
+      <w:numFmt w:val="lowerLetter"/>
+      <w:lvlText w:val="%2."/>
+      <w:lvlJc w:val="left"/>
+      <w:pPr>
+        <w:ind w:left="1440" w:hanging="360"/>
+      </w:pPr>
+    </w:lvl>
+    <w:lvl w:ilvl="2" w:tplc="FFFFFFFF" w:tentative="1">
+      <w:start w:val="1"/>
+      <w:numFmt w:val="lowerRoman"/>
+      <w:lvlText w:val="%3."/>
+      <w:lvlJc w:val="right"/>
+      <w:pPr>
+        <w:ind w:left="2160" w:hanging="180"/>
+      </w:pPr>
+    </w:lvl>
+    <w:lvl w:ilvl="3" w:tplc="FFFFFFFF" w:tentative="1">
+      <w:start w:val="1"/>
+      <w:numFmt w:val="decimal"/>
+      <w:lvlText w:val="%4."/>
+      <w:lvlJc w:val="left"/>
+      <w:pPr>
+        <w:ind w:left="2880" w:hanging="360"/>
+      </w:pPr>
+    </w:lvl>
+    <w:lvl w:ilvl="4" w:tplc="FFFFFFFF" w:tentative="1">
+      <w:start w:val="1"/>
+      <w:numFmt w:val="lowerLetter"/>
+      <w:lvlText w:val="%5."/>
+      <w:lvlJc w:val="left"/>
+      <w:pPr>
+        <w:ind w:left="3600" w:hanging="360"/>
+      </w:pPr>
+    </w:lvl>
+    <w:lvl w:ilvl="5" w:tplc="FFFFFFFF" w:tentative="1">
+      <w:start w:val="1"/>
+      <w:numFmt w:val="lowerRoman"/>
+      <w:lvlText w:val="%6."/>
+      <w:lvlJc w:val="right"/>
+      <w:pPr>
+        <w:ind w:left="4320" w:hanging="180"/>
+      </w:pPr>
+    </w:lvl>
+    <w:lvl w:ilvl="6" w:tplc="FFFFFFFF" w:tentative="1">
+      <w:start w:val="1"/>
+      <w:numFmt w:val="decimal"/>
+      <w:lvlText w:val="%7."/>
+      <w:lvlJc w:val="left"/>
+      <w:pPr>
+        <w:ind w:left="5040" w:hanging="360"/>
+      </w:pPr>
+    </w:lvl>
+    <w:lvl w:ilvl="7" w:tplc="FFFFFFFF" w:tentative="1">
+      <w:start w:val="1"/>
+      <w:numFmt w:val="lowerLetter"/>
+      <w:lvlText w:val="%8."/>
+      <w:lvlJc w:val="left"/>
+      <w:pPr>
+        <w:ind w:left="5760" w:hanging="360"/>
+      </w:pPr>
+    </w:lvl>
+    <w:lvl w:ilvl="8" w:tplc="FFFFFFFF" w:tentative="1">
+      <w:start w:val="1"/>
+      <w:numFmt w:val="lowerRoman"/>
+      <w:lvlText w:val="%9."/>
+      <w:lvlJc w:val="right"/>
+      <w:pPr>
+        <w:ind w:left="6480" w:hanging="180"/>
+      </w:pPr>
+    </w:lvl>
+  </w:abstractNum>
+  <w:abstractNum w:abstractNumId="5" w15:restartNumberingAfterBreak="0">
     <w:nsid w:val="15D53554"/>
     <w:multiLevelType w:val="hybridMultilevel"/>
     <w:tmpl w:val="5F129616"/>
@@ -6789,7 +8647,7 @@
       </w:pPr>
     </w:lvl>
   </w:abstractNum>
-  <w:abstractNum w:abstractNumId="5" w15:restartNumberingAfterBreak="0">
+  <w:abstractNum w:abstractNumId="6" w15:restartNumberingAfterBreak="0">
     <w:nsid w:val="18EC569B"/>
     <w:multiLevelType w:val="hybridMultilevel"/>
     <w:tmpl w:val="5F129616"/>
@@ -6878,7 +8736,7 @@
       </w:pPr>
     </w:lvl>
   </w:abstractNum>
-  <w:abstractNum w:abstractNumId="6" w15:restartNumberingAfterBreak="0">
+  <w:abstractNum w:abstractNumId="7" w15:restartNumberingAfterBreak="0">
     <w:nsid w:val="1A76525B"/>
     <w:multiLevelType w:val="hybridMultilevel"/>
     <w:tmpl w:val="B2F0238E"/>
@@ -6967,7 +8825,7 @@
       </w:pPr>
     </w:lvl>
   </w:abstractNum>
-  <w:abstractNum w:abstractNumId="7" w15:restartNumberingAfterBreak="0">
+  <w:abstractNum w:abstractNumId="8" w15:restartNumberingAfterBreak="0">
     <w:nsid w:val="1BB36BAF"/>
     <w:multiLevelType w:val="multilevel"/>
     <w:tmpl w:val="BABC4B72"/>
@@ -7080,7 +8938,7 @@
       </w:pPr>
     </w:lvl>
   </w:abstractNum>
-  <w:abstractNum w:abstractNumId="8" w15:restartNumberingAfterBreak="0">
+  <w:abstractNum w:abstractNumId="9" w15:restartNumberingAfterBreak="0">
     <w:nsid w:val="21CA7E9D"/>
     <w:multiLevelType w:val="multilevel"/>
     <w:tmpl w:val="42D692B6"/>
@@ -7193,7 +9051,7 @@
       </w:pPr>
     </w:lvl>
   </w:abstractNum>
-  <w:abstractNum w:abstractNumId="9" w15:restartNumberingAfterBreak="0">
+  <w:abstractNum w:abstractNumId="10" w15:restartNumberingAfterBreak="0">
     <w:nsid w:val="25543A2A"/>
     <w:multiLevelType w:val="hybridMultilevel"/>
     <w:tmpl w:val="5F129616"/>
@@ -7282,7 +9140,7 @@
       </w:pPr>
     </w:lvl>
   </w:abstractNum>
-  <w:abstractNum w:abstractNumId="10" w15:restartNumberingAfterBreak="0">
+  <w:abstractNum w:abstractNumId="11" w15:restartNumberingAfterBreak="0">
     <w:nsid w:val="28A61FED"/>
     <w:multiLevelType w:val="hybridMultilevel"/>
     <w:tmpl w:val="5F129616"/>
@@ -7371,7 +9229,7 @@
       </w:pPr>
     </w:lvl>
   </w:abstractNum>
-  <w:abstractNum w:abstractNumId="11" w15:restartNumberingAfterBreak="0">
+  <w:abstractNum w:abstractNumId="12" w15:restartNumberingAfterBreak="0">
     <w:nsid w:val="355002C3"/>
     <w:multiLevelType w:val="hybridMultilevel"/>
     <w:tmpl w:val="B2F0238E"/>
@@ -7460,7 +9318,7 @@
       </w:pPr>
     </w:lvl>
   </w:abstractNum>
-  <w:abstractNum w:abstractNumId="12" w15:restartNumberingAfterBreak="0">
+  <w:abstractNum w:abstractNumId="13" w15:restartNumberingAfterBreak="0">
     <w:nsid w:val="486C1830"/>
     <w:multiLevelType w:val="multilevel"/>
     <w:tmpl w:val="2BFE1E58"/>
@@ -7573,7 +9431,7 @@
       </w:pPr>
     </w:lvl>
   </w:abstractNum>
-  <w:abstractNum w:abstractNumId="13" w15:restartNumberingAfterBreak="0">
+  <w:abstractNum w:abstractNumId="14" w15:restartNumberingAfterBreak="0">
     <w:nsid w:val="4B4C6910"/>
     <w:multiLevelType w:val="hybridMultilevel"/>
     <w:tmpl w:val="5F129616"/>
@@ -7662,7 +9520,7 @@
       </w:pPr>
     </w:lvl>
   </w:abstractNum>
-  <w:abstractNum w:abstractNumId="14" w15:restartNumberingAfterBreak="0">
+  <w:abstractNum w:abstractNumId="15" w15:restartNumberingAfterBreak="0">
     <w:nsid w:val="4B664BB0"/>
     <w:multiLevelType w:val="multilevel"/>
     <w:tmpl w:val="A36A8D64"/>
@@ -7775,7 +9633,7 @@
       </w:pPr>
     </w:lvl>
   </w:abstractNum>
-  <w:abstractNum w:abstractNumId="15" w15:restartNumberingAfterBreak="0">
+  <w:abstractNum w:abstractNumId="16" w15:restartNumberingAfterBreak="0">
     <w:nsid w:val="4FC73F10"/>
     <w:multiLevelType w:val="hybridMultilevel"/>
     <w:tmpl w:val="BF525814"/>
@@ -7864,7 +9722,7 @@
       </w:pPr>
     </w:lvl>
   </w:abstractNum>
-  <w:abstractNum w:abstractNumId="16" w15:restartNumberingAfterBreak="0">
+  <w:abstractNum w:abstractNumId="17" w15:restartNumberingAfterBreak="0">
     <w:nsid w:val="515604CA"/>
     <w:multiLevelType w:val="hybridMultilevel"/>
     <w:tmpl w:val="5F129616"/>
@@ -7953,7 +9811,96 @@
       </w:pPr>
     </w:lvl>
   </w:abstractNum>
-  <w:abstractNum w:abstractNumId="17" w15:restartNumberingAfterBreak="0">
+  <w:abstractNum w:abstractNumId="18" w15:restartNumberingAfterBreak="0">
+    <w:nsid w:val="55A1445F"/>
+    <w:multiLevelType w:val="hybridMultilevel"/>
+    <w:tmpl w:val="5F129616"/>
+    <w:lvl w:ilvl="0" w:tplc="FFFFFFFF">
+      <w:start w:val="1"/>
+      <w:numFmt w:val="decimal"/>
+      <w:lvlText w:val="%1."/>
+      <w:lvlJc w:val="left"/>
+      <w:pPr>
+        <w:ind w:left="720" w:hanging="360"/>
+      </w:pPr>
+      <w:rPr>
+        <w:rFonts w:hint="default"/>
+      </w:rPr>
+    </w:lvl>
+    <w:lvl w:ilvl="1" w:tplc="FFFFFFFF" w:tentative="1">
+      <w:start w:val="1"/>
+      <w:numFmt w:val="lowerLetter"/>
+      <w:lvlText w:val="%2."/>
+      <w:lvlJc w:val="left"/>
+      <w:pPr>
+        <w:ind w:left="1440" w:hanging="360"/>
+      </w:pPr>
+    </w:lvl>
+    <w:lvl w:ilvl="2" w:tplc="FFFFFFFF" w:tentative="1">
+      <w:start w:val="1"/>
+      <w:numFmt w:val="lowerRoman"/>
+      <w:lvlText w:val="%3."/>
+      <w:lvlJc w:val="right"/>
+      <w:pPr>
+        <w:ind w:left="2160" w:hanging="180"/>
+      </w:pPr>
+    </w:lvl>
+    <w:lvl w:ilvl="3" w:tplc="FFFFFFFF" w:tentative="1">
+      <w:start w:val="1"/>
+      <w:numFmt w:val="decimal"/>
+      <w:lvlText w:val="%4."/>
+      <w:lvlJc w:val="left"/>
+      <w:pPr>
+        <w:ind w:left="2880" w:hanging="360"/>
+      </w:pPr>
+    </w:lvl>
+    <w:lvl w:ilvl="4" w:tplc="FFFFFFFF" w:tentative="1">
+      <w:start w:val="1"/>
+      <w:numFmt w:val="lowerLetter"/>
+      <w:lvlText w:val="%5."/>
+      <w:lvlJc w:val="left"/>
+      <w:pPr>
+        <w:ind w:left="3600" w:hanging="360"/>
+      </w:pPr>
+    </w:lvl>
+    <w:lvl w:ilvl="5" w:tplc="FFFFFFFF" w:tentative="1">
+      <w:start w:val="1"/>
+      <w:numFmt w:val="lowerRoman"/>
+      <w:lvlText w:val="%6."/>
+      <w:lvlJc w:val="right"/>
+      <w:pPr>
+        <w:ind w:left="4320" w:hanging="180"/>
+      </w:pPr>
+    </w:lvl>
+    <w:lvl w:ilvl="6" w:tplc="FFFFFFFF" w:tentative="1">
+      <w:start w:val="1"/>
+      <w:numFmt w:val="decimal"/>
+      <w:lvlText w:val="%7."/>
+      <w:lvlJc w:val="left"/>
+      <w:pPr>
+        <w:ind w:left="5040" w:hanging="360"/>
+      </w:pPr>
+    </w:lvl>
+    <w:lvl w:ilvl="7" w:tplc="FFFFFFFF" w:tentative="1">
+      <w:start w:val="1"/>
+      <w:numFmt w:val="lowerLetter"/>
+      <w:lvlText w:val="%8."/>
+      <w:lvlJc w:val="left"/>
+      <w:pPr>
+        <w:ind w:left="5760" w:hanging="360"/>
+      </w:pPr>
+    </w:lvl>
+    <w:lvl w:ilvl="8" w:tplc="FFFFFFFF" w:tentative="1">
+      <w:start w:val="1"/>
+      <w:numFmt w:val="lowerRoman"/>
+      <w:lvlText w:val="%9."/>
+      <w:lvlJc w:val="right"/>
+      <w:pPr>
+        <w:ind w:left="6480" w:hanging="180"/>
+      </w:pPr>
+    </w:lvl>
+  </w:abstractNum>
+  <w:abstractNum w:abstractNumId="19" w15:restartNumberingAfterBreak="0">
     <w:nsid w:val="5C9B63E0"/>
     <w:multiLevelType w:val="multilevel"/>
     <w:tmpl w:val="B47465EE"/>
@@ -8066,7 +10013,7 @@
       </w:pPr>
     </w:lvl>
   </w:abstractNum>
-  <w:abstractNum w:abstractNumId="18" w15:restartNumberingAfterBreak="0">
+  <w:abstractNum w:abstractNumId="20" w15:restartNumberingAfterBreak="0">
     <w:nsid w:val="6DAE6C45"/>
     <w:multiLevelType w:val="multilevel"/>
     <w:tmpl w:val="A850709E"/>
@@ -8179,7 +10126,7 @@
       </w:pPr>
     </w:lvl>
   </w:abstractNum>
-  <w:abstractNum w:abstractNumId="19" w15:restartNumberingAfterBreak="0">
+  <w:abstractNum w:abstractNumId="21" w15:restartNumberingAfterBreak="0">
     <w:nsid w:val="70165CE0"/>
     <w:multiLevelType w:val="hybridMultilevel"/>
     <w:tmpl w:val="5F129616"/>
@@ -8268,7 +10215,96 @@
       </w:pPr>
     </w:lvl>
   </w:abstractNum>
-  <w:abstractNum w:abstractNumId="20" w15:restartNumberingAfterBreak="0">
+  <w:abstractNum w:abstractNumId="22" w15:restartNumberingAfterBreak="0">
+    <w:nsid w:val="72A448A7"/>
+    <w:multiLevelType w:val="hybridMultilevel"/>
+    <w:tmpl w:val="5F129616"/>
+    <w:lvl w:ilvl="0" w:tplc="FFFFFFFF">
+      <w:start w:val="1"/>
+      <w:numFmt w:val="decimal"/>
+      <w:lvlText w:val="%1."/>
+      <w:lvlJc w:val="left"/>
+      <w:pPr>
+        <w:ind w:left="720" w:hanging="360"/>
+      </w:pPr>
+      <w:rPr>
+        <w:rFonts w:hint="default"/>
+      </w:rPr>
+    </w:lvl>
+    <w:lvl w:ilvl="1" w:tplc="FFFFFFFF" w:tentative="1">
+      <w:start w:val="1"/>
+      <w:numFmt w:val="lowerLetter"/>
+      <w:lvlText w:val="%2."/>
+      <w:lvlJc w:val="left"/>
+      <w:pPr>
+        <w:ind w:left="1440" w:hanging="360"/>
+      </w:pPr>
+    </w:lvl>
+    <w:lvl w:ilvl="2" w:tplc="FFFFFFFF" w:tentative="1">
+      <w:start w:val="1"/>
+      <w:numFmt w:val="lowerRoman"/>
+      <w:lvlText w:val="%3."/>
+      <w:lvlJc w:val="right"/>
+      <w:pPr>
+        <w:ind w:left="2160" w:hanging="180"/>
+      </w:pPr>
+    </w:lvl>
+    <w:lvl w:ilvl="3" w:tplc="FFFFFFFF" w:tentative="1">
+      <w:start w:val="1"/>
+      <w:numFmt w:val="decimal"/>
+      <w:lvlText w:val="%4."/>
+      <w:lvlJc w:val="left"/>
+      <w:pPr>
+        <w:ind w:left="2880" w:hanging="360"/>
+      </w:pPr>
+    </w:lvl>
+    <w:lvl w:ilvl="4" w:tplc="FFFFFFFF" w:tentative="1">
+      <w:start w:val="1"/>
+      <w:numFmt w:val="lowerLetter"/>
+      <w:lvlText w:val="%5."/>
+      <w:lvlJc w:val="left"/>
+      <w:pPr>
+        <w:ind w:left="3600" w:hanging="360"/>
+      </w:pPr>
+    </w:lvl>
+    <w:lvl w:ilvl="5" w:tplc="FFFFFFFF" w:tentative="1">
+      <w:start w:val="1"/>
+      <w:numFmt w:val="lowerRoman"/>
+      <w:lvlText w:val="%6."/>
+      <w:lvlJc w:val="right"/>
+      <w:pPr>
+        <w:ind w:left="4320" w:hanging="180"/>
+      </w:pPr>
+    </w:lvl>
+    <w:lvl w:ilvl="6" w:tplc="FFFFFFFF" w:tentative="1">
+      <w:start w:val="1"/>
+      <w:numFmt w:val="decimal"/>
+      <w:lvlText w:val="%7."/>
+      <w:lvlJc w:val="left"/>
+      <w:pPr>
+        <w:ind w:left="5040" w:hanging="360"/>
+      </w:pPr>
+    </w:lvl>
+    <w:lvl w:ilvl="7" w:tplc="FFFFFFFF" w:tentative="1">
+      <w:start w:val="1"/>
+      <w:numFmt w:val="lowerLetter"/>
+      <w:lvlText w:val="%8."/>
+      <w:lvlJc w:val="left"/>
+      <w:pPr>
+        <w:ind w:left="5760" w:hanging="360"/>
+      </w:pPr>
+    </w:lvl>
+    <w:lvl w:ilvl="8" w:tplc="FFFFFFFF" w:tentative="1">
+      <w:start w:val="1"/>
+      <w:numFmt w:val="lowerRoman"/>
+      <w:lvlText w:val="%9."/>
+      <w:lvlJc w:val="right"/>
+      <w:pPr>
+        <w:ind w:left="6480" w:hanging="180"/>
+      </w:pPr>
+    </w:lvl>
+  </w:abstractNum>
+  <w:abstractNum w:abstractNumId="23" w15:restartNumberingAfterBreak="0">
     <w:nsid w:val="7C7F5BA6"/>
     <w:multiLevelType w:val="hybridMultilevel"/>
     <w:tmpl w:val="B2F0238E"/>
@@ -8358,55 +10394,55 @@
     </w:lvl>
   </w:abstractNum>
   <w:num w:numId="1" w16cid:durableId="1035932433">
+    <w:abstractNumId w:val="6"/>
+  </w:num>
+  <w:num w:numId="2" w16cid:durableId="317266900">
     <w:abstractNumId w:val="5"/>
   </w:num>
-  <w:num w:numId="2" w16cid:durableId="317266900">
-    <w:abstractNumId w:val="4"/>
-  </w:num>
   <w:num w:numId="3" w16cid:durableId="749037571">
-    <w:abstractNumId w:val="15"/>
+    <w:abstractNumId w:val="16"/>
   </w:num>
   <w:num w:numId="4" w16cid:durableId="1980988269">
-    <w:abstractNumId w:val="20"/>
+    <w:abstractNumId w:val="23"/>
   </w:num>
   <w:num w:numId="5" w16cid:durableId="1019741722">
-    <w:abstractNumId w:val="6"/>
+    <w:abstractNumId w:val="7"/>
   </w:num>
   <w:num w:numId="6" w16cid:durableId="885750557">
-    <w:abstractNumId w:val="11"/>
+    <w:abstractNumId w:val="12"/>
   </w:num>
   <w:num w:numId="7" w16cid:durableId="1937977213">
-    <w:abstractNumId w:val="16"/>
+    <w:abstractNumId w:val="17"/>
   </w:num>
   <w:num w:numId="8" w16cid:durableId="1429695948">
     <w:abstractNumId w:val="0"/>
   </w:num>
   <w:num w:numId="9" w16cid:durableId="530999487">
-    <w:abstractNumId w:val="9"/>
+    <w:abstractNumId w:val="10"/>
   </w:num>
   <w:num w:numId="10" w16cid:durableId="2107145734">
-    <w:abstractNumId w:val="10"/>
+    <w:abstractNumId w:val="11"/>
   </w:num>
   <w:num w:numId="11" w16cid:durableId="1569800980">
+    <w:abstractNumId w:val="14"/>
+  </w:num>
+  <w:num w:numId="12" w16cid:durableId="1370573342">
+    <w:abstractNumId w:val="15"/>
+  </w:num>
+  <w:num w:numId="13" w16cid:durableId="1540898021">
+    <w:abstractNumId w:val="19"/>
+  </w:num>
+  <w:num w:numId="14" w16cid:durableId="1511800302">
+    <w:abstractNumId w:val="8"/>
+  </w:num>
+  <w:num w:numId="15" w16cid:durableId="1667325052">
+    <w:abstractNumId w:val="20"/>
+  </w:num>
+  <w:num w:numId="16" w16cid:durableId="828136808">
     <w:abstractNumId w:val="13"/>
   </w:num>
-  <w:num w:numId="12" w16cid:durableId="1370573342">
-    <w:abstractNumId w:val="14"/>
-  </w:num>
-  <w:num w:numId="13" w16cid:durableId="1540898021">
-    <w:abstractNumId w:val="17"/>
-  </w:num>
-  <w:num w:numId="14" w16cid:durableId="1511800302">
-    <w:abstractNumId w:val="7"/>
-  </w:num>
-  <w:num w:numId="15" w16cid:durableId="1667325052">
-    <w:abstractNumId w:val="18"/>
-  </w:num>
-  <w:num w:numId="16" w16cid:durableId="828136808">
-    <w:abstractNumId w:val="12"/>
-  </w:num>
   <w:num w:numId="17" w16cid:durableId="1840654078">
-    <w:abstractNumId w:val="8"/>
+    <w:abstractNumId w:val="9"/>
   </w:num>
   <w:num w:numId="18" w16cid:durableId="701898390">
     <w:abstractNumId w:val="3"/>
@@ -8418,7 +10454,16 @@
     <w:abstractNumId w:val="1"/>
   </w:num>
   <w:num w:numId="21" w16cid:durableId="1392001880">
-    <w:abstractNumId w:val="19"/>
+    <w:abstractNumId w:val="21"/>
+  </w:num>
+  <w:num w:numId="22" w16cid:durableId="617639395">
+    <w:abstractNumId w:val="18"/>
+  </w:num>
+  <w:num w:numId="23" w16cid:durableId="2052800904">
+    <w:abstractNumId w:val="22"/>
+  </w:num>
+  <w:num w:numId="24" w16cid:durableId="892811572">
+    <w:abstractNumId w:val="4"/>
   </w:num>
 </w:numbering>
 </file>
@@ -9025,6 +11070,7 @@
   <w:style w:type="character" w:default="1" w:styleId="Fuentedeprrafopredeter">
     <w:name w:val="Default Paragraph Font"/>
     <w:uiPriority w:val="1"/>
+    <w:semiHidden/>
     <w:unhideWhenUsed/>
   </w:style>
   <w:style w:type="table" w:default="1" w:styleId="Tablanormal">

</xml_diff>